<commit_message>
Marginal Planet’s Mini World 游戏项目设计方案.docx
</commit_message>
<xml_diff>
--- a/Docs/Marginal Planet’s Mini World 游戏项目设计方案.docx
+++ b/Docs/Marginal Planet’s Mini World 游戏项目设计方案.docx
@@ -61,7 +61,15 @@
           <w:i/>
           <w:iCs/>
         </w:rPr>
-        <w:t>V0.1</w:t>
+        <w:t>V0.</w:t>
+      </w:r>
+      <w:r>
+        <w:rPr>
+          <w:rFonts w:hint="eastAsia"/>
+          <w:i/>
+          <w:iCs/>
+        </w:rPr>
+        <w:t>2</w:t>
       </w:r>
     </w:p>
     <w:p>
@@ -285,7 +293,16 @@
           <w:p>
             <w:pPr>
               <w:jc w:val="center"/>
+              <w:rPr>
+                <w:rFonts w:hint="eastAsia"/>
+              </w:rPr>
             </w:pPr>
+            <w:r>
+              <w:rPr>
+                <w:rFonts w:hint="eastAsia"/>
+              </w:rPr>
+              <w:t>0.2</w:t>
+            </w:r>
           </w:p>
         </w:tc>
         <w:tc>
@@ -296,6 +313,12 @@
             <w:pPr>
               <w:jc w:val="center"/>
             </w:pPr>
+            <w:r>
+              <w:rPr>
+                <w:rFonts w:hint="eastAsia"/>
+              </w:rPr>
+              <w:t>N</w:t>
+            </w:r>
           </w:p>
         </w:tc>
         <w:tc>
@@ -306,6 +329,12 @@
             <w:pPr>
               <w:jc w:val="center"/>
             </w:pPr>
+            <w:r>
+              <w:rPr>
+                <w:rFonts w:hint="eastAsia"/>
+              </w:rPr>
+              <w:t>正文</w:t>
+            </w:r>
           </w:p>
         </w:tc>
         <w:tc>
@@ -315,7 +344,16 @@
           <w:p>
             <w:pPr>
               <w:jc w:val="center"/>
+              <w:rPr>
+                <w:rFonts w:hint="eastAsia"/>
+              </w:rPr>
             </w:pPr>
+            <w:r>
+              <w:rPr>
+                <w:rFonts w:hint="eastAsia"/>
+              </w:rPr>
+              <w:t>2026.4.22</w:t>
+            </w:r>
           </w:p>
         </w:tc>
         <w:tc>
@@ -326,6 +364,12 @@
             <w:pPr>
               <w:jc w:val="center"/>
             </w:pPr>
+            <w:r>
+              <w:rPr>
+                <w:rFonts w:hint="eastAsia"/>
+              </w:rPr>
+              <w:t>马修远</w:t>
+            </w:r>
           </w:p>
         </w:tc>
       </w:tr>
@@ -604,74 +648,6 @@
     </w:p>
     <w:p>
       <w:pPr>
-        <w:ind w:leftChars="600" w:left="1320"/>
-        <w:rPr>
-          <w:sz w:val="28"/>
-          <w:szCs w:val="28"/>
-        </w:rPr>
-      </w:pPr>
-      <w:r>
-        <w:rPr>
-          <w:rFonts w:hint="eastAsia"/>
-          <w:sz w:val="28"/>
-          <w:szCs w:val="28"/>
-        </w:rPr>
-        <w:t>伤害地块</w:t>
-      </w:r>
-    </w:p>
-    <w:p>
-      <w:pPr>
-        <w:ind w:leftChars="600" w:left="1320"/>
-        <w:rPr>
-          <w:sz w:val="28"/>
-          <w:szCs w:val="28"/>
-        </w:rPr>
-      </w:pPr>
-      <w:r>
-        <w:rPr>
-          <w:rFonts w:hint="eastAsia"/>
-          <w:sz w:val="28"/>
-          <w:szCs w:val="28"/>
-        </w:rPr>
-        <w:t>隐藏地块</w:t>
-      </w:r>
-    </w:p>
-    <w:p>
-      <w:pPr>
-        <w:ind w:leftChars="600" w:left="1320"/>
-        <w:rPr>
-          <w:sz w:val="28"/>
-          <w:szCs w:val="28"/>
-        </w:rPr>
-      </w:pPr>
-      <w:r>
-        <w:rPr>
-          <w:rFonts w:hint="eastAsia"/>
-          <w:sz w:val="28"/>
-          <w:szCs w:val="28"/>
-        </w:rPr>
-        <w:t>特殊效果地块</w:t>
-      </w:r>
-    </w:p>
-    <w:p>
-      <w:pPr>
-        <w:ind w:leftChars="600" w:left="1320"/>
-        <w:rPr>
-          <w:sz w:val="36"/>
-          <w:szCs w:val="36"/>
-        </w:rPr>
-      </w:pPr>
-      <w:r>
-        <w:rPr>
-          <w:rFonts w:hint="eastAsia"/>
-          <w:sz w:val="28"/>
-          <w:szCs w:val="28"/>
-        </w:rPr>
-        <w:t>可破坏地形</w:t>
-      </w:r>
-    </w:p>
-    <w:p>
-      <w:pPr>
         <w:ind w:leftChars="187" w:left="411"/>
         <w:rPr>
           <w:sz w:val="44"/>
@@ -722,40 +698,6 @@
     </w:p>
     <w:p>
       <w:pPr>
-        <w:ind w:leftChars="780" w:left="1716"/>
-        <w:rPr>
-          <w:sz w:val="28"/>
-          <w:szCs w:val="28"/>
-        </w:rPr>
-      </w:pPr>
-      <w:r>
-        <w:rPr>
-          <w:rFonts w:hint="eastAsia"/>
-          <w:sz w:val="28"/>
-          <w:szCs w:val="28"/>
-        </w:rPr>
-        <w:t xml:space="preserve">三围 · 生命/法术/体力 </w:t>
-      </w:r>
-    </w:p>
-    <w:p>
-      <w:pPr>
-        <w:ind w:leftChars="780" w:left="1716"/>
-        <w:rPr>
-          <w:sz w:val="28"/>
-          <w:szCs w:val="28"/>
-        </w:rPr>
-      </w:pPr>
-      <w:r>
-        <w:rPr>
-          <w:rFonts w:hint="eastAsia"/>
-          <w:sz w:val="28"/>
-          <w:szCs w:val="28"/>
-        </w:rPr>
-        <w:t>五项基础数值 · 力/敏/体/智/信</w:t>
-      </w:r>
-    </w:p>
-    <w:p>
-      <w:pPr>
         <w:ind w:left="1276"/>
         <w:rPr>
           <w:sz w:val="36"/>
@@ -781,65 +723,6 @@
     </w:p>
     <w:p>
       <w:pPr>
-        <w:ind w:leftChars="780" w:left="1716"/>
-        <w:rPr>
-          <w:sz w:val="28"/>
-          <w:szCs w:val="28"/>
-        </w:rPr>
-      </w:pPr>
-      <w:r>
-        <w:rPr>
-          <w:rFonts w:hint="eastAsia"/>
-          <w:sz w:val="28"/>
-          <w:szCs w:val="28"/>
-        </w:rPr>
-        <w:t>装备适配性</w:t>
-      </w:r>
-    </w:p>
-    <w:p>
-      <w:pPr>
-        <w:ind w:leftChars="780" w:left="1716"/>
-        <w:rPr>
-          <w:sz w:val="28"/>
-          <w:szCs w:val="28"/>
-        </w:rPr>
-      </w:pPr>
-      <w:r>
-        <w:rPr>
-          <w:rFonts w:hint="eastAsia"/>
-          <w:sz w:val="28"/>
-          <w:szCs w:val="28"/>
-        </w:rPr>
-        <w:lastRenderedPageBreak/>
-        <w:t>骨架</w:t>
-      </w:r>
-    </w:p>
-    <w:p>
-      <w:pPr>
-        <w:ind w:leftChars="780" w:left="1716"/>
-        <w:rPr>
-          <w:sz w:val="28"/>
-          <w:szCs w:val="28"/>
-        </w:rPr>
-      </w:pPr>
-      <w:r>
-        <w:rPr>
-          <w:sz w:val="28"/>
-          <w:szCs w:val="28"/>
-        </w:rPr>
-        <w:t>H</w:t>
-      </w:r>
-      <w:r>
-        <w:rPr>
-          <w:rFonts w:hint="eastAsia"/>
-          <w:sz w:val="28"/>
-          <w:szCs w:val="28"/>
-        </w:rPr>
-        <w:t>itbox</w:t>
-      </w:r>
-    </w:p>
-    <w:p>
-      <w:pPr>
         <w:ind w:left="1276"/>
         <w:rPr>
           <w:sz w:val="36"/>
@@ -865,58 +748,141 @@
     </w:p>
     <w:p>
       <w:pPr>
-        <w:ind w:leftChars="780" w:left="1716"/>
-        <w:rPr>
-          <w:sz w:val="28"/>
-          <w:szCs w:val="28"/>
-        </w:rPr>
-      </w:pPr>
-      <w:r>
-        <w:rPr>
-          <w:rFonts w:hint="eastAsia"/>
-          <w:sz w:val="28"/>
-          <w:szCs w:val="28"/>
-        </w:rPr>
-        <w:t>装备适配性</w:t>
-      </w:r>
-    </w:p>
-    <w:p>
-      <w:pPr>
-        <w:ind w:leftChars="780" w:left="1716"/>
-        <w:rPr>
-          <w:sz w:val="28"/>
-          <w:szCs w:val="28"/>
-        </w:rPr>
-      </w:pPr>
-      <w:r>
-        <w:rPr>
-          <w:rFonts w:hint="eastAsia"/>
-          <w:sz w:val="28"/>
-          <w:szCs w:val="28"/>
-        </w:rPr>
-        <w:t>待机动画</w:t>
-      </w:r>
-    </w:p>
-    <w:p>
-      <w:pPr>
-        <w:ind w:leftChars="780" w:left="1716"/>
-        <w:rPr>
-          <w:sz w:val="28"/>
-          <w:szCs w:val="28"/>
-        </w:rPr>
-      </w:pPr>
-      <w:r>
-        <w:rPr>
-          <w:rFonts w:hint="eastAsia"/>
-          <w:sz w:val="28"/>
-          <w:szCs w:val="28"/>
-        </w:rPr>
-        <w:t>移动动画</w:t>
-      </w:r>
-    </w:p>
-    <w:p>
-      <w:pPr>
-        <w:ind w:leftChars="880" w:left="1936"/>
+        <w:ind w:leftChars="187" w:left="411"/>
+        <w:rPr>
+          <w:sz w:val="44"/>
+          <w:szCs w:val="44"/>
+        </w:rPr>
+      </w:pPr>
+      <w:r>
+        <w:rPr>
+          <w:rFonts w:hint="eastAsia"/>
+          <w:sz w:val="44"/>
+          <w:szCs w:val="44"/>
+        </w:rPr>
+        <w:t>1.3</w:t>
+      </w:r>
+      <w:r>
+        <w:rPr>
+          <w:rFonts w:hint="eastAsia"/>
+          <w:sz w:val="44"/>
+          <w:szCs w:val="44"/>
+        </w:rPr>
+        <w:t>装备</w:t>
+      </w:r>
+    </w:p>
+    <w:p>
+      <w:pPr>
+        <w:ind w:leftChars="587" w:left="1291"/>
+        <w:rPr>
+          <w:sz w:val="36"/>
+          <w:szCs w:val="36"/>
+        </w:rPr>
+      </w:pPr>
+      <w:r>
+        <w:rPr>
+          <w:rFonts w:hint="eastAsia"/>
+          <w:sz w:val="36"/>
+          <w:szCs w:val="36"/>
+        </w:rPr>
+        <w:t>1.3.1</w:t>
+      </w:r>
+      <w:r>
+        <w:rPr>
+          <w:rFonts w:hint="eastAsia"/>
+          <w:sz w:val="36"/>
+          <w:szCs w:val="36"/>
+        </w:rPr>
+        <w:t>稀有度</w:t>
+      </w:r>
+    </w:p>
+    <w:p>
+      <w:pPr>
+        <w:ind w:leftChars="587" w:left="1291"/>
+        <w:rPr>
+          <w:sz w:val="36"/>
+          <w:szCs w:val="36"/>
+        </w:rPr>
+      </w:pPr>
+      <w:r>
+        <w:rPr>
+          <w:rFonts w:hint="eastAsia"/>
+          <w:sz w:val="36"/>
+          <w:szCs w:val="36"/>
+        </w:rPr>
+        <w:t>1.3.2</w:t>
+      </w:r>
+      <w:r>
+        <w:rPr>
+          <w:rFonts w:hint="eastAsia"/>
+          <w:sz w:val="36"/>
+          <w:szCs w:val="36"/>
+        </w:rPr>
+        <w:t>护甲</w:t>
+      </w:r>
+    </w:p>
+    <w:p>
+      <w:pPr>
+        <w:ind w:leftChars="587" w:left="1291"/>
+        <w:rPr>
+          <w:sz w:val="36"/>
+          <w:szCs w:val="36"/>
+        </w:rPr>
+      </w:pPr>
+      <w:r>
+        <w:rPr>
+          <w:rFonts w:hint="eastAsia"/>
+          <w:sz w:val="36"/>
+          <w:szCs w:val="36"/>
+        </w:rPr>
+        <w:t>1.3.3</w:t>
+      </w:r>
+      <w:r>
+        <w:rPr>
+          <w:rFonts w:hint="eastAsia"/>
+          <w:sz w:val="36"/>
+          <w:szCs w:val="36"/>
+        </w:rPr>
+        <w:t>武器</w:t>
+      </w:r>
+    </w:p>
+    <w:p>
+      <w:pPr>
+        <w:ind w:leftChars="787" w:left="1731"/>
+        <w:rPr>
+          <w:sz w:val="28"/>
+          <w:szCs w:val="28"/>
+        </w:rPr>
+      </w:pPr>
+      <w:r>
+        <w:rPr>
+          <w:rFonts w:hint="eastAsia"/>
+          <w:sz w:val="28"/>
+          <w:szCs w:val="28"/>
+        </w:rPr>
+        <w:t>类型</w:t>
+      </w:r>
+    </w:p>
+    <w:p>
+      <w:pPr>
+        <w:ind w:leftChars="787" w:left="1731"/>
+        <w:rPr>
+          <w:sz w:val="28"/>
+          <w:szCs w:val="28"/>
+        </w:rPr>
+      </w:pPr>
+      <w:r>
+        <w:rPr>
+          <w:rFonts w:hint="eastAsia"/>
+          <w:sz w:val="28"/>
+          <w:szCs w:val="28"/>
+        </w:rPr>
+        <w:t>持有方式</w:t>
+      </w:r>
+    </w:p>
+    <w:p>
+      <w:pPr>
+        <w:ind w:leftChars="987" w:left="2171"/>
         <w:rPr>
           <w:sz w:val="20"/>
           <w:szCs w:val="20"/>
@@ -928,63 +894,135 @@
           <w:sz w:val="20"/>
           <w:szCs w:val="20"/>
         </w:rPr>
-        <w:t>走/跑/冲刺/跳跃/蹲</w:t>
-      </w:r>
-      <w:r>
-        <w:rPr>
-          <w:sz w:val="20"/>
-          <w:szCs w:val="20"/>
-        </w:rPr>
-        <w:t>(</w:t>
-      </w:r>
-      <w:r>
-        <w:rPr>
-          <w:rFonts w:hint="eastAsia"/>
-          <w:sz w:val="20"/>
-          <w:szCs w:val="20"/>
-        </w:rPr>
-        <w:t>潜行</w:t>
-      </w:r>
-      <w:r>
-        <w:rPr>
-          <w:sz w:val="20"/>
-          <w:szCs w:val="20"/>
-        </w:rPr>
-        <w:t>)</w:t>
-      </w:r>
-    </w:p>
-    <w:p>
-      <w:pPr>
-        <w:ind w:leftChars="780" w:left="1716"/>
-        <w:rPr>
-          <w:sz w:val="28"/>
-          <w:szCs w:val="28"/>
-        </w:rPr>
-      </w:pPr>
-      <w:r>
-        <w:rPr>
-          <w:rFonts w:hint="eastAsia"/>
-          <w:sz w:val="28"/>
-          <w:szCs w:val="28"/>
-        </w:rPr>
-        <w:t>战斗动画</w:t>
-      </w:r>
-    </w:p>
-    <w:p>
-      <w:pPr>
-        <w:ind w:leftChars="880" w:left="1936"/>
-        <w:rPr>
-          <w:sz w:val="20"/>
-          <w:szCs w:val="20"/>
-        </w:rPr>
-      </w:pPr>
-      <w:r>
-        <w:rPr>
-          <w:rFonts w:hint="eastAsia"/>
-          <w:sz w:val="20"/>
-          <w:szCs w:val="20"/>
-        </w:rPr>
-        <w:t>攻击/防御/受击/受控（多种）</w:t>
+        <w:lastRenderedPageBreak/>
+        <w:t>单手/双手/两用/双持/脱手</w:t>
+      </w:r>
+    </w:p>
+    <w:p>
+      <w:pPr>
+        <w:ind w:leftChars="787" w:left="1731"/>
+        <w:rPr>
+          <w:sz w:val="28"/>
+          <w:szCs w:val="28"/>
+        </w:rPr>
+      </w:pPr>
+      <w:r>
+        <w:rPr>
+          <w:rFonts w:hint="eastAsia"/>
+          <w:sz w:val="28"/>
+          <w:szCs w:val="28"/>
+        </w:rPr>
+        <w:t>战技</w:t>
+      </w:r>
+    </w:p>
+    <w:p>
+      <w:pPr>
+        <w:ind w:leftChars="787" w:left="1731"/>
+        <w:rPr>
+          <w:sz w:val="28"/>
+          <w:szCs w:val="28"/>
+        </w:rPr>
+      </w:pPr>
+      <w:r>
+        <w:rPr>
+          <w:rFonts w:hint="eastAsia"/>
+          <w:sz w:val="28"/>
+          <w:szCs w:val="28"/>
+        </w:rPr>
+        <w:t>动作模组</w:t>
+      </w:r>
+    </w:p>
+    <w:p>
+      <w:pPr>
+        <w:ind w:leftChars="587" w:left="1291"/>
+        <w:rPr>
+          <w:sz w:val="36"/>
+          <w:szCs w:val="36"/>
+        </w:rPr>
+      </w:pPr>
+      <w:r>
+        <w:rPr>
+          <w:rFonts w:hint="eastAsia"/>
+          <w:sz w:val="36"/>
+          <w:szCs w:val="36"/>
+        </w:rPr>
+        <w:t>1.3.4</w:t>
+      </w:r>
+      <w:r>
+        <w:rPr>
+          <w:rFonts w:hint="eastAsia"/>
+          <w:sz w:val="36"/>
+          <w:szCs w:val="36"/>
+        </w:rPr>
+        <w:t>道具</w:t>
+      </w:r>
+    </w:p>
+    <w:p>
+      <w:pPr>
+        <w:ind w:leftChars="787" w:left="1731"/>
+        <w:rPr>
+          <w:sz w:val="28"/>
+          <w:szCs w:val="28"/>
+        </w:rPr>
+      </w:pPr>
+      <w:r>
+        <w:rPr>
+          <w:rFonts w:hint="eastAsia"/>
+          <w:sz w:val="28"/>
+          <w:szCs w:val="28"/>
+        </w:rPr>
+        <w:t>背包</w:t>
+      </w:r>
+    </w:p>
+    <w:p>
+      <w:pPr>
+        <w:ind w:leftChars="787" w:left="1731"/>
+        <w:rPr>
+          <w:sz w:val="28"/>
+          <w:szCs w:val="28"/>
+        </w:rPr>
+      </w:pPr>
+      <w:r>
+        <w:rPr>
+          <w:rFonts w:hint="eastAsia"/>
+          <w:sz w:val="28"/>
+          <w:szCs w:val="28"/>
+        </w:rPr>
+        <w:t>药水</w:t>
+      </w:r>
+    </w:p>
+    <w:p>
+      <w:pPr>
+        <w:ind w:leftChars="787" w:left="1731"/>
+        <w:rPr>
+          <w:sz w:val="28"/>
+          <w:szCs w:val="28"/>
+        </w:rPr>
+      </w:pPr>
+      <w:r>
+        <w:rPr>
+          <w:rFonts w:hint="eastAsia"/>
+          <w:sz w:val="28"/>
+          <w:szCs w:val="28"/>
+        </w:rPr>
+        <w:t>投掷物</w:t>
+      </w:r>
+    </w:p>
+    <w:p>
+      <w:pPr>
+        <w:ind w:leftChars="787" w:left="1731"/>
+        <w:rPr>
+          <w:sz w:val="28"/>
+          <w:szCs w:val="28"/>
+        </w:rPr>
+      </w:pPr>
+      <w:r>
+        <w:rPr>
+          <w:rFonts w:hint="eastAsia"/>
+          <w:sz w:val="28"/>
+          <w:szCs w:val="28"/>
+        </w:rPr>
+        <w:t>重要物品</w:t>
       </w:r>
     </w:p>
     <w:p>
@@ -1001,7 +1039,7 @@
           <w:sz w:val="44"/>
           <w:szCs w:val="44"/>
         </w:rPr>
-        <w:t>1.3</w:t>
+        <w:t>1.4</w:t>
       </w:r>
       <w:r>
         <w:rPr>
@@ -1009,329 +1047,7 @@
           <w:sz w:val="44"/>
           <w:szCs w:val="44"/>
         </w:rPr>
-        <w:t>装备</w:t>
-      </w:r>
-    </w:p>
-    <w:p>
-      <w:pPr>
-        <w:ind w:leftChars="587" w:left="1291"/>
-        <w:rPr>
-          <w:sz w:val="36"/>
-          <w:szCs w:val="36"/>
-        </w:rPr>
-      </w:pPr>
-      <w:r>
-        <w:rPr>
-          <w:rFonts w:hint="eastAsia"/>
-          <w:sz w:val="36"/>
-          <w:szCs w:val="36"/>
-        </w:rPr>
-        <w:t>1.3.1</w:t>
-      </w:r>
-      <w:r>
-        <w:rPr>
-          <w:rFonts w:hint="eastAsia"/>
-          <w:sz w:val="36"/>
-          <w:szCs w:val="36"/>
-        </w:rPr>
-        <w:t>稀有度</w:t>
-      </w:r>
-    </w:p>
-    <w:p>
-      <w:pPr>
-        <w:ind w:leftChars="587" w:left="1291"/>
-        <w:rPr>
-          <w:sz w:val="36"/>
-          <w:szCs w:val="36"/>
-        </w:rPr>
-      </w:pPr>
-      <w:r>
-        <w:rPr>
-          <w:rFonts w:hint="eastAsia"/>
-          <w:sz w:val="36"/>
-          <w:szCs w:val="36"/>
-        </w:rPr>
-        <w:t>1.3.2</w:t>
-      </w:r>
-      <w:r>
-        <w:rPr>
-          <w:rFonts w:hint="eastAsia"/>
-          <w:sz w:val="36"/>
-          <w:szCs w:val="36"/>
-        </w:rPr>
-        <w:t>护甲</w:t>
-      </w:r>
-    </w:p>
-    <w:p>
-      <w:pPr>
-        <w:ind w:leftChars="787" w:left="1731"/>
-        <w:rPr>
-          <w:sz w:val="28"/>
-          <w:szCs w:val="28"/>
-        </w:rPr>
-      </w:pPr>
-      <w:r>
-        <w:rPr>
-          <w:rFonts w:hint="eastAsia"/>
-          <w:sz w:val="28"/>
-          <w:szCs w:val="28"/>
-        </w:rPr>
-        <w:t>类型</w:t>
-      </w:r>
-    </w:p>
-    <w:p>
-      <w:pPr>
-        <w:ind w:leftChars="787" w:left="1731"/>
-        <w:rPr>
-          <w:sz w:val="28"/>
-          <w:szCs w:val="28"/>
-        </w:rPr>
-      </w:pPr>
-      <w:r>
-        <w:rPr>
-          <w:rFonts w:hint="eastAsia"/>
-          <w:sz w:val="28"/>
-          <w:szCs w:val="28"/>
-        </w:rPr>
-        <w:t>插槽</w:t>
-      </w:r>
-    </w:p>
-    <w:p>
-      <w:pPr>
-        <w:ind w:leftChars="787" w:left="1731"/>
-        <w:rPr>
-          <w:sz w:val="28"/>
-          <w:szCs w:val="28"/>
-        </w:rPr>
-      </w:pPr>
-      <w:r>
-        <w:rPr>
-          <w:rFonts w:hint="eastAsia"/>
-          <w:sz w:val="28"/>
-          <w:szCs w:val="28"/>
-        </w:rPr>
-        <w:t>基础数值与补正方式</w:t>
-      </w:r>
-    </w:p>
-    <w:p>
-      <w:pPr>
-        <w:ind w:leftChars="787" w:left="1731"/>
-        <w:rPr>
-          <w:sz w:val="28"/>
-          <w:szCs w:val="28"/>
-        </w:rPr>
-      </w:pPr>
-      <w:r>
-        <w:rPr>
-          <w:rFonts w:hint="eastAsia"/>
-          <w:sz w:val="28"/>
-          <w:szCs w:val="28"/>
-        </w:rPr>
-        <w:t>套装效果</w:t>
-      </w:r>
-    </w:p>
-    <w:p>
-      <w:pPr>
-        <w:ind w:leftChars="587" w:left="1291"/>
-        <w:rPr>
-          <w:sz w:val="36"/>
-          <w:szCs w:val="36"/>
-        </w:rPr>
-      </w:pPr>
-      <w:r>
-        <w:rPr>
-          <w:rFonts w:hint="eastAsia"/>
-          <w:sz w:val="36"/>
-          <w:szCs w:val="36"/>
-        </w:rPr>
-        <w:t>1.3.3</w:t>
-      </w:r>
-      <w:r>
-        <w:rPr>
-          <w:rFonts w:hint="eastAsia"/>
-          <w:sz w:val="36"/>
-          <w:szCs w:val="36"/>
-        </w:rPr>
-        <w:t>武器</w:t>
-      </w:r>
-    </w:p>
-    <w:p>
-      <w:pPr>
-        <w:ind w:leftChars="787" w:left="1731"/>
-        <w:rPr>
-          <w:sz w:val="28"/>
-          <w:szCs w:val="28"/>
-        </w:rPr>
-      </w:pPr>
-      <w:r>
-        <w:rPr>
-          <w:rFonts w:hint="eastAsia"/>
-          <w:sz w:val="28"/>
-          <w:szCs w:val="28"/>
-        </w:rPr>
-        <w:t>类型</w:t>
-      </w:r>
-    </w:p>
-    <w:p>
-      <w:pPr>
-        <w:ind w:leftChars="787" w:left="1731"/>
-        <w:rPr>
-          <w:sz w:val="28"/>
-          <w:szCs w:val="28"/>
-        </w:rPr>
-      </w:pPr>
-      <w:r>
-        <w:rPr>
-          <w:rFonts w:hint="eastAsia"/>
-          <w:sz w:val="28"/>
-          <w:szCs w:val="28"/>
-        </w:rPr>
-        <w:lastRenderedPageBreak/>
-        <w:t>持有方式</w:t>
-      </w:r>
-    </w:p>
-    <w:p>
-      <w:pPr>
-        <w:ind w:leftChars="987" w:left="2171"/>
-        <w:rPr>
-          <w:sz w:val="20"/>
-          <w:szCs w:val="20"/>
-        </w:rPr>
-      </w:pPr>
-      <w:r>
-        <w:rPr>
-          <w:rFonts w:hint="eastAsia"/>
-          <w:sz w:val="20"/>
-          <w:szCs w:val="20"/>
-        </w:rPr>
-        <w:t>单手/双手/两用/双持/脱手</w:t>
-      </w:r>
-    </w:p>
-    <w:p>
-      <w:pPr>
-        <w:ind w:leftChars="787" w:left="1731"/>
-        <w:rPr>
-          <w:sz w:val="28"/>
-          <w:szCs w:val="28"/>
-        </w:rPr>
-      </w:pPr>
-      <w:r>
-        <w:rPr>
-          <w:rFonts w:hint="eastAsia"/>
-          <w:sz w:val="28"/>
-          <w:szCs w:val="28"/>
-        </w:rPr>
-        <w:t>战技</w:t>
-      </w:r>
-    </w:p>
-    <w:p>
-      <w:pPr>
-        <w:ind w:leftChars="787" w:left="1731"/>
-        <w:rPr>
-          <w:sz w:val="28"/>
-          <w:szCs w:val="28"/>
-        </w:rPr>
-      </w:pPr>
-      <w:r>
-        <w:rPr>
-          <w:rFonts w:hint="eastAsia"/>
-          <w:sz w:val="28"/>
-          <w:szCs w:val="28"/>
-        </w:rPr>
-        <w:t>动作模组</w:t>
-      </w:r>
-    </w:p>
-    <w:p>
-      <w:pPr>
-        <w:ind w:leftChars="587" w:left="1291"/>
-        <w:rPr>
-          <w:sz w:val="36"/>
-          <w:szCs w:val="36"/>
-        </w:rPr>
-      </w:pPr>
-      <w:r>
-        <w:rPr>
-          <w:rFonts w:hint="eastAsia"/>
-          <w:sz w:val="36"/>
-          <w:szCs w:val="36"/>
-        </w:rPr>
-        <w:t>1.3.4</w:t>
-      </w:r>
-      <w:r>
-        <w:rPr>
-          <w:rFonts w:hint="eastAsia"/>
-          <w:sz w:val="36"/>
-          <w:szCs w:val="36"/>
-        </w:rPr>
-        <w:t>道具</w:t>
-      </w:r>
-    </w:p>
-    <w:p>
-      <w:pPr>
-        <w:ind w:leftChars="787" w:left="1731"/>
-        <w:rPr>
-          <w:sz w:val="28"/>
-          <w:szCs w:val="28"/>
-        </w:rPr>
-      </w:pPr>
-      <w:r>
-        <w:rPr>
-          <w:rFonts w:hint="eastAsia"/>
-          <w:sz w:val="28"/>
-          <w:szCs w:val="28"/>
-        </w:rPr>
-        <w:t>背包</w:t>
-      </w:r>
-    </w:p>
-    <w:p>
-      <w:pPr>
-        <w:ind w:leftChars="787" w:left="1731"/>
-        <w:rPr>
-          <w:sz w:val="28"/>
-          <w:szCs w:val="28"/>
-        </w:rPr>
-      </w:pPr>
-      <w:r>
-        <w:rPr>
-          <w:rFonts w:hint="eastAsia"/>
-          <w:sz w:val="28"/>
-          <w:szCs w:val="28"/>
-        </w:rPr>
-        <w:t>药水</w:t>
-      </w:r>
-    </w:p>
-    <w:p>
-      <w:pPr>
-        <w:ind w:leftChars="787" w:left="1731"/>
-        <w:rPr>
-          <w:sz w:val="28"/>
-          <w:szCs w:val="28"/>
-        </w:rPr>
-      </w:pPr>
-      <w:r>
-        <w:rPr>
-          <w:rFonts w:hint="eastAsia"/>
-          <w:sz w:val="28"/>
-          <w:szCs w:val="28"/>
-        </w:rPr>
-        <w:t>投掷物</w:t>
-      </w:r>
-    </w:p>
-    <w:p>
-      <w:pPr>
-        <w:ind w:leftChars="787" w:left="1731"/>
-        <w:rPr>
-          <w:sz w:val="28"/>
-          <w:szCs w:val="28"/>
-        </w:rPr>
-      </w:pPr>
-      <w:r>
-        <w:rPr>
-          <w:rFonts w:hint="eastAsia"/>
-          <w:sz w:val="28"/>
-          <w:szCs w:val="28"/>
-        </w:rPr>
-        <w:t>重要物品</w:t>
+        <w:t>数值设计</w:t>
       </w:r>
     </w:p>
     <w:p>
@@ -1348,7 +1064,7 @@
           <w:sz w:val="44"/>
           <w:szCs w:val="44"/>
         </w:rPr>
-        <w:t>1.4</w:t>
+        <w:t>1.5</w:t>
       </w:r>
       <w:r>
         <w:rPr>
@@ -1356,7 +1072,7 @@
           <w:sz w:val="44"/>
           <w:szCs w:val="44"/>
         </w:rPr>
-        <w:t>数值设计</w:t>
+        <w:t>难度曲线</w:t>
       </w:r>
     </w:p>
     <w:p>
@@ -1373,7 +1089,7 @@
           <w:sz w:val="44"/>
           <w:szCs w:val="44"/>
         </w:rPr>
-        <w:t>1.5</w:t>
+        <w:t>1.6</w:t>
       </w:r>
       <w:r>
         <w:rPr>
@@ -1381,7 +1097,268 @@
           <w:sz w:val="44"/>
           <w:szCs w:val="44"/>
         </w:rPr>
-        <w:t>难度曲线</w:t>
+        <w:t>攻击</w:t>
+      </w:r>
+    </w:p>
+    <w:p>
+      <w:pPr>
+        <w:ind w:leftChars="587" w:left="1291"/>
+        <w:rPr>
+          <w:sz w:val="36"/>
+          <w:szCs w:val="36"/>
+        </w:rPr>
+      </w:pPr>
+      <w:r>
+        <w:rPr>
+          <w:rFonts w:hint="eastAsia"/>
+          <w:sz w:val="36"/>
+          <w:szCs w:val="36"/>
+        </w:rPr>
+        <w:t>1.6.1伤害数字计算优先级</w:t>
+      </w:r>
+    </w:p>
+    <w:p>
+      <w:pPr>
+        <w:ind w:leftChars="587" w:left="1291"/>
+        <w:rPr>
+          <w:sz w:val="36"/>
+          <w:szCs w:val="36"/>
+        </w:rPr>
+      </w:pPr>
+      <w:r>
+        <w:rPr>
+          <w:rFonts w:hint="eastAsia"/>
+          <w:sz w:val="36"/>
+          <w:szCs w:val="36"/>
+        </w:rPr>
+        <w:t>1.6.2</w:t>
+      </w:r>
+      <w:r>
+        <w:rPr>
+          <w:rFonts w:hint="eastAsia"/>
+          <w:sz w:val="36"/>
+          <w:szCs w:val="36"/>
+        </w:rPr>
+        <w:t>增伤</w:t>
+      </w:r>
+      <w:r>
+        <w:rPr>
+          <w:rFonts w:hint="eastAsia"/>
+          <w:sz w:val="36"/>
+          <w:szCs w:val="36"/>
+        </w:rPr>
+        <w:t>乘区</w:t>
+      </w:r>
+    </w:p>
+    <w:p>
+      <w:pPr>
+        <w:ind w:leftChars="587" w:left="1291"/>
+        <w:rPr>
+          <w:sz w:val="36"/>
+          <w:szCs w:val="36"/>
+        </w:rPr>
+      </w:pPr>
+      <w:r>
+        <w:rPr>
+          <w:rFonts w:hint="eastAsia"/>
+          <w:sz w:val="36"/>
+          <w:szCs w:val="36"/>
+        </w:rPr>
+        <w:t>1.6.</w:t>
+      </w:r>
+      <w:r>
+        <w:rPr>
+          <w:rFonts w:hint="eastAsia"/>
+          <w:sz w:val="36"/>
+          <w:szCs w:val="36"/>
+        </w:rPr>
+        <w:t>3</w:t>
+      </w:r>
+      <w:r>
+        <w:rPr>
+          <w:rFonts w:hint="eastAsia"/>
+          <w:sz w:val="36"/>
+          <w:szCs w:val="36"/>
+        </w:rPr>
+        <w:t>物理与法术攻击</w:t>
+      </w:r>
+    </w:p>
+    <w:p>
+      <w:pPr>
+        <w:ind w:leftChars="787" w:left="1731"/>
+        <w:rPr>
+          <w:sz w:val="28"/>
+          <w:szCs w:val="28"/>
+        </w:rPr>
+      </w:pPr>
+      <w:r>
+        <w:rPr>
+          <w:rFonts w:hint="eastAsia"/>
+          <w:sz w:val="28"/>
+          <w:szCs w:val="28"/>
+        </w:rPr>
+        <w:t>物理攻击的穿深和伤害</w:t>
+      </w:r>
+    </w:p>
+    <w:p>
+      <w:pPr>
+        <w:ind w:leftChars="787" w:left="1731"/>
+        <w:rPr>
+          <w:sz w:val="28"/>
+          <w:szCs w:val="28"/>
+        </w:rPr>
+      </w:pPr>
+      <w:r>
+        <w:rPr>
+          <w:rFonts w:hint="eastAsia"/>
+          <w:sz w:val="28"/>
+          <w:szCs w:val="28"/>
+        </w:rPr>
+        <w:t>破甲线</w:t>
+      </w:r>
+    </w:p>
+    <w:p>
+      <w:pPr>
+        <w:ind w:leftChars="587" w:left="1291"/>
+        <w:rPr>
+          <w:sz w:val="36"/>
+          <w:szCs w:val="36"/>
+        </w:rPr>
+      </w:pPr>
+      <w:r>
+        <w:rPr>
+          <w:rFonts w:hint="eastAsia"/>
+          <w:sz w:val="36"/>
+          <w:szCs w:val="36"/>
+        </w:rPr>
+        <w:t>1.6.</w:t>
+      </w:r>
+      <w:r>
+        <w:rPr>
+          <w:rFonts w:hint="eastAsia"/>
+          <w:sz w:val="36"/>
+          <w:szCs w:val="36"/>
+        </w:rPr>
+        <w:t>4</w:t>
+      </w:r>
+      <w:r>
+        <w:rPr>
+          <w:rFonts w:hint="eastAsia"/>
+          <w:sz w:val="36"/>
+          <w:szCs w:val="36"/>
+        </w:rPr>
+        <w:t>元素与特殊攻击</w:t>
+      </w:r>
+    </w:p>
+    <w:p>
+      <w:pPr>
+        <w:ind w:leftChars="787" w:left="1731"/>
+        <w:rPr>
+          <w:sz w:val="28"/>
+          <w:szCs w:val="28"/>
+        </w:rPr>
+      </w:pPr>
+      <w:r>
+        <w:rPr>
+          <w:rFonts w:hint="eastAsia"/>
+          <w:sz w:val="28"/>
+          <w:szCs w:val="28"/>
+        </w:rPr>
+        <w:t>元素攻击种类</w:t>
+      </w:r>
+    </w:p>
+    <w:p>
+      <w:pPr>
+        <w:ind w:leftChars="787" w:left="1731"/>
+        <w:rPr>
+          <w:sz w:val="28"/>
+          <w:szCs w:val="28"/>
+        </w:rPr>
+      </w:pPr>
+      <w:r>
+        <w:rPr>
+          <w:rFonts w:hint="eastAsia"/>
+          <w:sz w:val="28"/>
+          <w:szCs w:val="28"/>
+        </w:rPr>
+        <w:lastRenderedPageBreak/>
+        <w:t>元素效果累加效果</w:t>
+      </w:r>
+    </w:p>
+    <w:p>
+      <w:pPr>
+        <w:ind w:leftChars="787" w:left="1731"/>
+        <w:rPr>
+          <w:sz w:val="28"/>
+          <w:szCs w:val="28"/>
+        </w:rPr>
+      </w:pPr>
+      <w:r>
+        <w:rPr>
+          <w:rFonts w:hint="eastAsia"/>
+          <w:sz w:val="28"/>
+          <w:szCs w:val="28"/>
+        </w:rPr>
+        <w:t>特殊攻击种类</w:t>
+      </w:r>
+    </w:p>
+    <w:p>
+      <w:pPr>
+        <w:ind w:leftChars="787" w:left="1731"/>
+        <w:rPr>
+          <w:sz w:val="28"/>
+          <w:szCs w:val="28"/>
+        </w:rPr>
+      </w:pPr>
+      <w:r>
+        <w:rPr>
+          <w:rFonts w:hint="eastAsia"/>
+          <w:sz w:val="28"/>
+          <w:szCs w:val="28"/>
+        </w:rPr>
+        <w:t>特殊攻击累加效果</w:t>
+      </w:r>
+    </w:p>
+    <w:p>
+      <w:pPr>
+        <w:ind w:leftChars="787" w:left="1731"/>
+        <w:rPr>
+          <w:sz w:val="28"/>
+          <w:szCs w:val="28"/>
+        </w:rPr>
+      </w:pPr>
+      <w:r>
+        <w:rPr>
+          <w:rFonts w:hint="eastAsia"/>
+          <w:sz w:val="28"/>
+          <w:szCs w:val="28"/>
+        </w:rPr>
+        <w:t>元素反应</w:t>
+      </w:r>
+    </w:p>
+    <w:p>
+      <w:pPr>
+        <w:ind w:leftChars="587" w:left="1291"/>
+        <w:rPr>
+          <w:sz w:val="36"/>
+          <w:szCs w:val="36"/>
+        </w:rPr>
+      </w:pPr>
+      <w:r>
+        <w:rPr>
+          <w:rFonts w:hint="eastAsia"/>
+          <w:sz w:val="36"/>
+          <w:szCs w:val="36"/>
+        </w:rPr>
+        <w:t>1.6.5</w:t>
+      </w:r>
+      <w:r>
+        <w:rPr>
+          <w:rFonts w:hint="eastAsia"/>
+          <w:sz w:val="36"/>
+          <w:szCs w:val="36"/>
+        </w:rPr>
+        <w:t>伤害判定（Hitbox）</w:t>
       </w:r>
     </w:p>
     <w:p>
@@ -1398,7 +1375,7 @@
           <w:sz w:val="44"/>
           <w:szCs w:val="44"/>
         </w:rPr>
-        <w:t>1.6</w:t>
+        <w:t>1.7</w:t>
       </w:r>
       <w:r>
         <w:rPr>
@@ -1406,7 +1383,7 @@
           <w:sz w:val="44"/>
           <w:szCs w:val="44"/>
         </w:rPr>
-        <w:t>攻击</w:t>
+        <w:t>防守</w:t>
       </w:r>
     </w:p>
     <w:p>
@@ -1423,7 +1400,41 @@
           <w:sz w:val="36"/>
           <w:szCs w:val="36"/>
         </w:rPr>
-        <w:t>1.6.1伤害数字计算优先级</w:t>
+        <w:t>1.7.1护甲等级与减伤机制</w:t>
+      </w:r>
+    </w:p>
+    <w:p>
+      <w:pPr>
+        <w:ind w:leftChars="787" w:left="1731"/>
+        <w:rPr>
+          <w:sz w:val="28"/>
+          <w:szCs w:val="28"/>
+        </w:rPr>
+      </w:pPr>
+      <w:r>
+        <w:rPr>
+          <w:rFonts w:hint="eastAsia"/>
+          <w:sz w:val="28"/>
+          <w:szCs w:val="28"/>
+        </w:rPr>
+        <w:t>护甲等级与完全防御</w:t>
+      </w:r>
+    </w:p>
+    <w:p>
+      <w:pPr>
+        <w:ind w:leftChars="787" w:left="1731"/>
+        <w:rPr>
+          <w:sz w:val="28"/>
+          <w:szCs w:val="28"/>
+        </w:rPr>
+      </w:pPr>
+      <w:r>
+        <w:rPr>
+          <w:rFonts w:hint="eastAsia"/>
+          <w:sz w:val="28"/>
+          <w:szCs w:val="28"/>
+        </w:rPr>
+        <w:t>物理护甲减伤结算方式</w:t>
       </w:r>
     </w:p>
     <w:p>
@@ -1440,23 +1451,66 @@
           <w:sz w:val="36"/>
           <w:szCs w:val="36"/>
         </w:rPr>
-        <w:t>1.6.2</w:t>
-      </w:r>
-      <w:r>
-        <w:rPr>
-          <w:rFonts w:hint="eastAsia"/>
-          <w:sz w:val="36"/>
-          <w:szCs w:val="36"/>
-        </w:rPr>
-        <w:t>增伤</w:t>
-      </w:r>
-      <w:r>
-        <w:rPr>
-          <w:rFonts w:hint="eastAsia"/>
-          <w:sz w:val="36"/>
-          <w:szCs w:val="36"/>
-        </w:rPr>
-        <w:t>乘区</w:t>
+        <w:t>1.7.2法术防御</w:t>
+      </w:r>
+    </w:p>
+    <w:p>
+      <w:pPr>
+        <w:ind w:leftChars="787" w:left="1731"/>
+        <w:rPr>
+          <w:sz w:val="28"/>
+          <w:szCs w:val="28"/>
+        </w:rPr>
+      </w:pPr>
+      <w:r>
+        <w:rPr>
+          <w:rFonts w:hint="eastAsia"/>
+          <w:sz w:val="28"/>
+          <w:szCs w:val="28"/>
+        </w:rPr>
+        <w:t>法术抗性减伤</w:t>
+      </w:r>
+      <w:r>
+        <w:rPr>
+          <w:rFonts w:hint="eastAsia"/>
+          <w:sz w:val="28"/>
+          <w:szCs w:val="28"/>
+        </w:rPr>
+        <w:t>计算方式</w:t>
+      </w:r>
+    </w:p>
+    <w:p>
+      <w:pPr>
+        <w:ind w:leftChars="787" w:left="1731"/>
+        <w:rPr>
+          <w:sz w:val="28"/>
+          <w:szCs w:val="28"/>
+        </w:rPr>
+      </w:pPr>
+      <w:r>
+        <w:rPr>
+          <w:rFonts w:hint="eastAsia"/>
+          <w:sz w:val="28"/>
+          <w:szCs w:val="28"/>
+        </w:rPr>
+        <w:t>法术抗性的其他来源</w:t>
+      </w:r>
+    </w:p>
+    <w:p>
+      <w:pPr>
+        <w:ind w:leftChars="787" w:left="1731"/>
+        <w:rPr>
+          <w:sz w:val="28"/>
+          <w:szCs w:val="28"/>
+        </w:rPr>
+      </w:pPr>
+      <w:r>
+        <w:rPr>
+          <w:rFonts w:hint="eastAsia"/>
+          <w:sz w:val="28"/>
+          <w:szCs w:val="28"/>
+        </w:rPr>
+        <w:t>法抗护甲的法术伤害吸收转化机制</w:t>
       </w:r>
     </w:p>
     <w:p>
@@ -1473,23 +1527,41 @@
           <w:sz w:val="36"/>
           <w:szCs w:val="36"/>
         </w:rPr>
-        <w:t>1.6.</w:t>
-      </w:r>
-      <w:r>
-        <w:rPr>
-          <w:rFonts w:hint="eastAsia"/>
-          <w:sz w:val="36"/>
-          <w:szCs w:val="36"/>
-        </w:rPr>
-        <w:t>3</w:t>
-      </w:r>
-      <w:r>
-        <w:rPr>
-          <w:rFonts w:hint="eastAsia"/>
-          <w:sz w:val="36"/>
-          <w:szCs w:val="36"/>
-        </w:rPr>
-        <w:t>物理与法术攻击</w:t>
+        <w:t>1.7.3元素抗性</w:t>
+      </w:r>
+    </w:p>
+    <w:p>
+      <w:pPr>
+        <w:ind w:leftChars="587" w:left="1291"/>
+        <w:rPr>
+          <w:sz w:val="36"/>
+          <w:szCs w:val="36"/>
+        </w:rPr>
+      </w:pPr>
+      <w:r>
+        <w:rPr>
+          <w:rFonts w:hint="eastAsia"/>
+          <w:sz w:val="36"/>
+          <w:szCs w:val="36"/>
+        </w:rPr>
+        <w:t>1.7.4效果抗性</w:t>
+      </w:r>
+    </w:p>
+    <w:p>
+      <w:pPr>
+        <w:ind w:leftChars="587" w:left="1291"/>
+        <w:rPr>
+          <w:sz w:val="36"/>
+          <w:szCs w:val="36"/>
+        </w:rPr>
+      </w:pPr>
+      <w:r>
+        <w:rPr>
+          <w:rFonts w:hint="eastAsia"/>
+          <w:sz w:val="36"/>
+          <w:szCs w:val="36"/>
+        </w:rPr>
+        <w:t>1.7.5格挡</w:t>
       </w:r>
     </w:p>
     <w:p>
@@ -1506,7 +1578,7 @@
           <w:sz w:val="28"/>
           <w:szCs w:val="28"/>
         </w:rPr>
-        <w:t>物理攻击的穿深和伤害</w:t>
+        <w:t>持续格挡</w:t>
       </w:r>
     </w:p>
     <w:p>
@@ -1523,40 +1595,7 @@
           <w:sz w:val="28"/>
           <w:szCs w:val="28"/>
         </w:rPr>
-        <w:t>破甲线</w:t>
-      </w:r>
-    </w:p>
-    <w:p>
-      <w:pPr>
-        <w:ind w:leftChars="587" w:left="1291"/>
-        <w:rPr>
-          <w:sz w:val="36"/>
-          <w:szCs w:val="36"/>
-        </w:rPr>
-      </w:pPr>
-      <w:r>
-        <w:rPr>
-          <w:rFonts w:hint="eastAsia"/>
-          <w:sz w:val="36"/>
-          <w:szCs w:val="36"/>
-        </w:rPr>
-        <w:t>1.6.</w:t>
-      </w:r>
-      <w:r>
-        <w:rPr>
-          <w:rFonts w:hint="eastAsia"/>
-          <w:sz w:val="36"/>
-          <w:szCs w:val="36"/>
-        </w:rPr>
-        <w:t>4</w:t>
-      </w:r>
-      <w:r>
-        <w:rPr>
-          <w:rFonts w:hint="eastAsia"/>
-          <w:sz w:val="36"/>
-          <w:szCs w:val="36"/>
-        </w:rPr>
-        <w:t>元素与特殊攻击</w:t>
+        <w:t>精准格挡</w:t>
       </w:r>
     </w:p>
     <w:p>
@@ -1567,6 +1606,7 @@
           <w:szCs w:val="28"/>
         </w:rPr>
       </w:pPr>
+      <w:proofErr w:type="spellStart"/>
       <w:r>
         <w:rPr>
           <w:rFonts w:hint="eastAsia"/>
@@ -1574,355 +1614,6 @@
           <w:szCs w:val="28"/>
         </w:rPr>
         <w:lastRenderedPageBreak/>
-        <w:t>元素攻击种类</w:t>
-      </w:r>
-    </w:p>
-    <w:p>
-      <w:pPr>
-        <w:ind w:leftChars="787" w:left="1731"/>
-        <w:rPr>
-          <w:sz w:val="28"/>
-          <w:szCs w:val="28"/>
-        </w:rPr>
-      </w:pPr>
-      <w:r>
-        <w:rPr>
-          <w:rFonts w:hint="eastAsia"/>
-          <w:sz w:val="28"/>
-          <w:szCs w:val="28"/>
-        </w:rPr>
-        <w:t>元素效果累加效果</w:t>
-      </w:r>
-    </w:p>
-    <w:p>
-      <w:pPr>
-        <w:ind w:leftChars="787" w:left="1731"/>
-        <w:rPr>
-          <w:sz w:val="28"/>
-          <w:szCs w:val="28"/>
-        </w:rPr>
-      </w:pPr>
-      <w:r>
-        <w:rPr>
-          <w:rFonts w:hint="eastAsia"/>
-          <w:sz w:val="28"/>
-          <w:szCs w:val="28"/>
-        </w:rPr>
-        <w:t>特殊攻击种类</w:t>
-      </w:r>
-    </w:p>
-    <w:p>
-      <w:pPr>
-        <w:ind w:leftChars="787" w:left="1731"/>
-        <w:rPr>
-          <w:sz w:val="28"/>
-          <w:szCs w:val="28"/>
-        </w:rPr>
-      </w:pPr>
-      <w:r>
-        <w:rPr>
-          <w:rFonts w:hint="eastAsia"/>
-          <w:sz w:val="28"/>
-          <w:szCs w:val="28"/>
-        </w:rPr>
-        <w:t>特殊攻击累加效果</w:t>
-      </w:r>
-    </w:p>
-    <w:p>
-      <w:pPr>
-        <w:ind w:leftChars="787" w:left="1731"/>
-        <w:rPr>
-          <w:sz w:val="28"/>
-          <w:szCs w:val="28"/>
-        </w:rPr>
-      </w:pPr>
-      <w:r>
-        <w:rPr>
-          <w:rFonts w:hint="eastAsia"/>
-          <w:sz w:val="28"/>
-          <w:szCs w:val="28"/>
-        </w:rPr>
-        <w:t>元素反应</w:t>
-      </w:r>
-    </w:p>
-    <w:p>
-      <w:pPr>
-        <w:ind w:leftChars="587" w:left="1291"/>
-        <w:rPr>
-          <w:sz w:val="36"/>
-          <w:szCs w:val="36"/>
-        </w:rPr>
-      </w:pPr>
-      <w:r>
-        <w:rPr>
-          <w:rFonts w:hint="eastAsia"/>
-          <w:sz w:val="36"/>
-          <w:szCs w:val="36"/>
-        </w:rPr>
-        <w:t>1.6.5</w:t>
-      </w:r>
-      <w:r>
-        <w:rPr>
-          <w:rFonts w:hint="eastAsia"/>
-          <w:sz w:val="36"/>
-          <w:szCs w:val="36"/>
-        </w:rPr>
-        <w:t>伤害判定（Hitbox）</w:t>
-      </w:r>
-    </w:p>
-    <w:p>
-      <w:pPr>
-        <w:ind w:leftChars="187" w:left="411"/>
-        <w:rPr>
-          <w:sz w:val="44"/>
-          <w:szCs w:val="44"/>
-        </w:rPr>
-      </w:pPr>
-      <w:r>
-        <w:rPr>
-          <w:rFonts w:hint="eastAsia"/>
-          <w:sz w:val="44"/>
-          <w:szCs w:val="44"/>
-        </w:rPr>
-        <w:t>1.7</w:t>
-      </w:r>
-      <w:r>
-        <w:rPr>
-          <w:rFonts w:hint="eastAsia"/>
-          <w:sz w:val="44"/>
-          <w:szCs w:val="44"/>
-        </w:rPr>
-        <w:t>防守</w:t>
-      </w:r>
-    </w:p>
-    <w:p>
-      <w:pPr>
-        <w:ind w:leftChars="587" w:left="1291"/>
-        <w:rPr>
-          <w:sz w:val="36"/>
-          <w:szCs w:val="36"/>
-        </w:rPr>
-      </w:pPr>
-      <w:r>
-        <w:rPr>
-          <w:rFonts w:hint="eastAsia"/>
-          <w:sz w:val="36"/>
-          <w:szCs w:val="36"/>
-        </w:rPr>
-        <w:t>1.7.1护甲等级与减伤机制</w:t>
-      </w:r>
-    </w:p>
-    <w:p>
-      <w:pPr>
-        <w:ind w:leftChars="787" w:left="1731"/>
-        <w:rPr>
-          <w:sz w:val="28"/>
-          <w:szCs w:val="28"/>
-        </w:rPr>
-      </w:pPr>
-      <w:r>
-        <w:rPr>
-          <w:rFonts w:hint="eastAsia"/>
-          <w:sz w:val="28"/>
-          <w:szCs w:val="28"/>
-        </w:rPr>
-        <w:t>护甲等级与完全防御</w:t>
-      </w:r>
-    </w:p>
-    <w:p>
-      <w:pPr>
-        <w:ind w:leftChars="787" w:left="1731"/>
-        <w:rPr>
-          <w:sz w:val="28"/>
-          <w:szCs w:val="28"/>
-        </w:rPr>
-      </w:pPr>
-      <w:r>
-        <w:rPr>
-          <w:rFonts w:hint="eastAsia"/>
-          <w:sz w:val="28"/>
-          <w:szCs w:val="28"/>
-        </w:rPr>
-        <w:t>物理护甲减伤结算方式</w:t>
-      </w:r>
-    </w:p>
-    <w:p>
-      <w:pPr>
-        <w:ind w:leftChars="587" w:left="1291"/>
-        <w:rPr>
-          <w:sz w:val="36"/>
-          <w:szCs w:val="36"/>
-        </w:rPr>
-      </w:pPr>
-      <w:r>
-        <w:rPr>
-          <w:rFonts w:hint="eastAsia"/>
-          <w:sz w:val="36"/>
-          <w:szCs w:val="36"/>
-        </w:rPr>
-        <w:t>1.7.2法术防御</w:t>
-      </w:r>
-    </w:p>
-    <w:p>
-      <w:pPr>
-        <w:ind w:leftChars="787" w:left="1731"/>
-        <w:rPr>
-          <w:sz w:val="28"/>
-          <w:szCs w:val="28"/>
-        </w:rPr>
-      </w:pPr>
-      <w:r>
-        <w:rPr>
-          <w:rFonts w:hint="eastAsia"/>
-          <w:sz w:val="28"/>
-          <w:szCs w:val="28"/>
-        </w:rPr>
-        <w:t>法术抗性减伤</w:t>
-      </w:r>
-      <w:r>
-        <w:rPr>
-          <w:rFonts w:hint="eastAsia"/>
-          <w:sz w:val="28"/>
-          <w:szCs w:val="28"/>
-        </w:rPr>
-        <w:t>计算方式</w:t>
-      </w:r>
-    </w:p>
-    <w:p>
-      <w:pPr>
-        <w:ind w:leftChars="787" w:left="1731"/>
-        <w:rPr>
-          <w:sz w:val="28"/>
-          <w:szCs w:val="28"/>
-        </w:rPr>
-      </w:pPr>
-      <w:r>
-        <w:rPr>
-          <w:rFonts w:hint="eastAsia"/>
-          <w:sz w:val="28"/>
-          <w:szCs w:val="28"/>
-        </w:rPr>
-        <w:t>法术抗性的其他来源</w:t>
-      </w:r>
-    </w:p>
-    <w:p>
-      <w:pPr>
-        <w:ind w:leftChars="787" w:left="1731"/>
-        <w:rPr>
-          <w:sz w:val="28"/>
-          <w:szCs w:val="28"/>
-        </w:rPr>
-      </w:pPr>
-      <w:r>
-        <w:rPr>
-          <w:rFonts w:hint="eastAsia"/>
-          <w:sz w:val="28"/>
-          <w:szCs w:val="28"/>
-        </w:rPr>
-        <w:t>法抗护甲的法术伤害吸收转化机制</w:t>
-      </w:r>
-    </w:p>
-    <w:p>
-      <w:pPr>
-        <w:ind w:leftChars="587" w:left="1291"/>
-        <w:rPr>
-          <w:sz w:val="36"/>
-          <w:szCs w:val="36"/>
-        </w:rPr>
-      </w:pPr>
-      <w:r>
-        <w:rPr>
-          <w:rFonts w:hint="eastAsia"/>
-          <w:sz w:val="36"/>
-          <w:szCs w:val="36"/>
-        </w:rPr>
-        <w:t>1.7.3元素抗性</w:t>
-      </w:r>
-    </w:p>
-    <w:p>
-      <w:pPr>
-        <w:ind w:leftChars="587" w:left="1291"/>
-        <w:rPr>
-          <w:sz w:val="36"/>
-          <w:szCs w:val="36"/>
-        </w:rPr>
-      </w:pPr>
-      <w:r>
-        <w:rPr>
-          <w:rFonts w:hint="eastAsia"/>
-          <w:sz w:val="36"/>
-          <w:szCs w:val="36"/>
-        </w:rPr>
-        <w:t>1.7.4效果抗性</w:t>
-      </w:r>
-    </w:p>
-    <w:p>
-      <w:pPr>
-        <w:ind w:leftChars="587" w:left="1291"/>
-        <w:rPr>
-          <w:sz w:val="36"/>
-          <w:szCs w:val="36"/>
-        </w:rPr>
-      </w:pPr>
-      <w:r>
-        <w:rPr>
-          <w:rFonts w:hint="eastAsia"/>
-          <w:sz w:val="36"/>
-          <w:szCs w:val="36"/>
-        </w:rPr>
-        <w:t>1.7.5格挡</w:t>
-      </w:r>
-    </w:p>
-    <w:p>
-      <w:pPr>
-        <w:ind w:leftChars="787" w:left="1731"/>
-        <w:rPr>
-          <w:sz w:val="28"/>
-          <w:szCs w:val="28"/>
-        </w:rPr>
-      </w:pPr>
-      <w:r>
-        <w:rPr>
-          <w:rFonts w:hint="eastAsia"/>
-          <w:sz w:val="28"/>
-          <w:szCs w:val="28"/>
-        </w:rPr>
-        <w:t>持续格挡</w:t>
-      </w:r>
-    </w:p>
-    <w:p>
-      <w:pPr>
-        <w:ind w:leftChars="787" w:left="1731"/>
-        <w:rPr>
-          <w:sz w:val="28"/>
-          <w:szCs w:val="28"/>
-        </w:rPr>
-      </w:pPr>
-      <w:r>
-        <w:rPr>
-          <w:rFonts w:hint="eastAsia"/>
-          <w:sz w:val="28"/>
-          <w:szCs w:val="28"/>
-        </w:rPr>
-        <w:lastRenderedPageBreak/>
-        <w:t>精准格挡</w:t>
-      </w:r>
-    </w:p>
-    <w:p>
-      <w:pPr>
-        <w:ind w:leftChars="787" w:left="1731"/>
-        <w:rPr>
-          <w:sz w:val="28"/>
-          <w:szCs w:val="28"/>
-        </w:rPr>
-      </w:pPr>
-      <w:proofErr w:type="spellStart"/>
-      <w:r>
-        <w:rPr>
-          <w:rFonts w:hint="eastAsia"/>
-          <w:sz w:val="28"/>
-          <w:szCs w:val="28"/>
-        </w:rPr>
         <w:t>GuardPoint</w:t>
       </w:r>
       <w:proofErr w:type="spellEnd"/>
@@ -2499,6 +2190,7 @@
       <w:pPr>
         <w:ind w:leftChars="200" w:left="440"/>
         <w:rPr>
+          <w:rFonts w:hint="eastAsia"/>
           <w:sz w:val="28"/>
           <w:szCs w:val="28"/>
         </w:rPr>
@@ -2591,7 +2283,8 @@
       <w:pPr>
         <w:ind w:leftChars="200" w:left="440"/>
         <w:rPr>
-          <w:rFonts w:hint="eastAsia"/>
+          <w:b/>
+          <w:bCs/>
           <w:sz w:val="32"/>
           <w:szCs w:val="32"/>
         </w:rPr>
@@ -2599,11 +2292,672 @@
       <w:r>
         <w:rPr>
           <w:rFonts w:hint="eastAsia"/>
+          <w:b/>
+          <w:bCs/>
           <w:sz w:val="32"/>
           <w:szCs w:val="32"/>
         </w:rPr>
         <w:t>1.2.1人物基础数值</w:t>
       </w:r>
+    </w:p>
+    <w:p>
+      <w:pPr>
+        <w:ind w:leftChars="200" w:left="440"/>
+        <w:rPr>
+          <w:szCs w:val="22"/>
+        </w:rPr>
+      </w:pPr>
+      <w:r>
+        <w:rPr>
+          <w:rFonts w:hint="eastAsia"/>
+          <w:szCs w:val="22"/>
+        </w:rPr>
+        <w:t>三维·生命/法术/体力</w:t>
+      </w:r>
+    </w:p>
+    <w:p>
+      <w:pPr>
+        <w:ind w:leftChars="200" w:left="440"/>
+        <w:rPr>
+          <w:rFonts w:hint="eastAsia"/>
+          <w:szCs w:val="22"/>
+        </w:rPr>
+      </w:pPr>
+      <w:r>
+        <w:rPr>
+          <w:rFonts w:hint="eastAsia"/>
+          <w:szCs w:val="22"/>
+        </w:rPr>
+        <w:t>生命：在战局内受到伤害时减少，归零时死亡游戏结束。战局外不会减少。</w:t>
+      </w:r>
+    </w:p>
+    <w:p>
+      <w:pPr>
+        <w:ind w:leftChars="200" w:left="440"/>
+        <w:rPr>
+          <w:szCs w:val="22"/>
+        </w:rPr>
+      </w:pPr>
+      <w:r>
+        <w:rPr>
+          <w:rFonts w:hint="eastAsia"/>
+          <w:szCs w:val="22"/>
+        </w:rPr>
+        <w:t>法术：用于释放法术、技能或某些武器的战技的资源。</w:t>
+      </w:r>
+    </w:p>
+    <w:p>
+      <w:pPr>
+        <w:ind w:leftChars="200" w:left="440"/>
+        <w:rPr>
+          <w:szCs w:val="22"/>
+        </w:rPr>
+      </w:pPr>
+      <w:r>
+        <w:rPr>
+          <w:rFonts w:hint="eastAsia"/>
+          <w:szCs w:val="22"/>
+        </w:rPr>
+        <w:t>体力：某些招式攻击、抵挡攻击、闪避等动作会用到的资源。耗尽后仍可移动，但无法攻击/格挡/闪避。会随时间自动回复。</w:t>
+      </w:r>
+    </w:p>
+    <w:p>
+      <w:pPr>
+        <w:ind w:leftChars="200" w:left="440"/>
+        <w:rPr>
+          <w:rFonts w:hint="eastAsia"/>
+          <w:szCs w:val="22"/>
+        </w:rPr>
+      </w:pPr>
+    </w:p>
+    <w:p>
+      <w:pPr>
+        <w:ind w:leftChars="200" w:left="440"/>
+        <w:rPr>
+          <w:szCs w:val="22"/>
+        </w:rPr>
+      </w:pPr>
+      <w:r>
+        <w:rPr>
+          <w:rFonts w:hint="eastAsia"/>
+          <w:szCs w:val="22"/>
+        </w:rPr>
+        <w:t>五项基础属性·力量/敏捷/体质/智力/信仰（魅力）</w:t>
+      </w:r>
+    </w:p>
+    <w:p>
+      <w:pPr>
+        <w:ind w:leftChars="200" w:left="440"/>
+        <w:rPr>
+          <w:szCs w:val="22"/>
+        </w:rPr>
+      </w:pPr>
+      <w:r>
+        <w:rPr>
+          <w:rFonts w:hint="eastAsia"/>
+          <w:szCs w:val="22"/>
+        </w:rPr>
+        <w:t>不同的武器攻击力会在面板基础上加上相应属性的补正倍率×玩家基础属性</w:t>
+      </w:r>
+    </w:p>
+    <w:p>
+      <w:pPr>
+        <w:ind w:leftChars="200" w:left="440"/>
+        <w:rPr>
+          <w:szCs w:val="22"/>
+        </w:rPr>
+      </w:pPr>
+      <w:r>
+        <w:rPr>
+          <w:rFonts w:hint="eastAsia"/>
+          <w:szCs w:val="22"/>
+        </w:rPr>
+        <w:t>例如一把大剑有45面板攻击，力量补正40%，敏捷补正10%。玩家力量10敏捷10</w:t>
+      </w:r>
+    </w:p>
+    <w:p>
+      <w:pPr>
+        <w:ind w:leftChars="200" w:left="440"/>
+        <w:rPr>
+          <w:szCs w:val="22"/>
+        </w:rPr>
+      </w:pPr>
+      <w:r>
+        <w:rPr>
+          <w:rFonts w:hint="eastAsia"/>
+          <w:szCs w:val="22"/>
+        </w:rPr>
+        <w:t>最终面板45</w:t>
+      </w:r>
+      <w:r>
+        <w:rPr>
+          <w:rFonts w:hint="eastAsia"/>
+          <w:szCs w:val="22"/>
+        </w:rPr>
+        <w:t>+</w:t>
+      </w:r>
+      <w:r>
+        <w:rPr>
+          <w:szCs w:val="22"/>
+        </w:rPr>
+        <w:t>10</w:t>
+      </w:r>
+      <w:r>
+        <w:rPr>
+          <w:rFonts w:hint="eastAsia"/>
+          <w:szCs w:val="22"/>
+        </w:rPr>
+        <w:t>×</w:t>
+      </w:r>
+      <w:r>
+        <w:rPr>
+          <w:szCs w:val="22"/>
+        </w:rPr>
+        <w:t>0.4+</w:t>
+      </w:r>
+      <w:r>
+        <w:rPr>
+          <w:rFonts w:hint="eastAsia"/>
+          <w:szCs w:val="22"/>
+        </w:rPr>
+        <w:t>10×0.1=50</w:t>
+      </w:r>
+    </w:p>
+    <w:p>
+      <w:pPr>
+        <w:ind w:leftChars="200" w:left="440"/>
+        <w:rPr>
+          <w:rFonts w:hint="eastAsia"/>
+          <w:szCs w:val="22"/>
+        </w:rPr>
+      </w:pPr>
+      <w:r>
+        <w:rPr>
+          <w:rFonts w:hint="eastAsia"/>
+          <w:szCs w:val="22"/>
+        </w:rPr>
+        <w:t>多数武器存在一个可以可以使用此武器最小能力限制，例如一把大剑的最小能力限制是10力10敏。若玩家任意一个属性小于这个值使用此武器，则武器性能会大减</w:t>
+      </w:r>
+      <w:r>
+        <w:rPr>
+          <w:rFonts w:hint="eastAsia"/>
+          <w:szCs w:val="22"/>
+        </w:rPr>
+        <w:t>，同时出现挥不动剑的动画。</w:t>
+      </w:r>
+    </w:p>
+    <w:p>
+      <w:pPr>
+        <w:ind w:leftChars="200" w:left="440"/>
+        <w:rPr>
+          <w:b/>
+          <w:bCs/>
+          <w:sz w:val="32"/>
+          <w:szCs w:val="32"/>
+        </w:rPr>
+      </w:pPr>
+      <w:r>
+        <w:rPr>
+          <w:rFonts w:hint="eastAsia"/>
+          <w:b/>
+          <w:bCs/>
+          <w:sz w:val="32"/>
+          <w:szCs w:val="32"/>
+        </w:rPr>
+        <w:t>1.2.2人物外观</w:t>
+      </w:r>
+    </w:p>
+    <w:p>
+      <w:pPr>
+        <w:ind w:leftChars="200" w:left="440"/>
+        <w:rPr>
+          <w:szCs w:val="22"/>
+        </w:rPr>
+      </w:pPr>
+      <w:r>
+        <w:rPr>
+          <w:rFonts w:hint="eastAsia"/>
+          <w:szCs w:val="22"/>
+        </w:rPr>
+        <w:t>人物外观统一为像素画风格，使用</w:t>
+      </w:r>
+      <w:proofErr w:type="spellStart"/>
+      <w:r>
+        <w:rPr>
+          <w:rFonts w:hint="eastAsia"/>
+          <w:szCs w:val="22"/>
+        </w:rPr>
+        <w:t>Resprite</w:t>
+      </w:r>
+      <w:proofErr w:type="spellEnd"/>
+      <w:r>
+        <w:rPr>
+          <w:rFonts w:hint="eastAsia"/>
+          <w:szCs w:val="22"/>
+        </w:rPr>
+        <w:t>绘制或者开源资产。</w:t>
+      </w:r>
+    </w:p>
+    <w:p>
+      <w:pPr>
+        <w:ind w:leftChars="200" w:left="440"/>
+        <w:rPr>
+          <w:sz w:val="28"/>
+          <w:szCs w:val="28"/>
+        </w:rPr>
+      </w:pPr>
+      <w:r>
+        <w:rPr>
+          <w:rFonts w:hint="eastAsia"/>
+          <w:sz w:val="28"/>
+          <w:szCs w:val="28"/>
+        </w:rPr>
+        <w:t>装备适配性</w:t>
+      </w:r>
+    </w:p>
+    <w:p>
+      <w:pPr>
+        <w:ind w:leftChars="200" w:left="440"/>
+        <w:rPr>
+          <w:szCs w:val="22"/>
+        </w:rPr>
+      </w:pPr>
+      <w:r>
+        <w:rPr>
+          <w:rFonts w:hint="eastAsia"/>
+          <w:szCs w:val="22"/>
+        </w:rPr>
+        <w:t>每款装备都会设计两种风格以适配男性体型角色和女性体型角色。统一装备穿在不同体型角色身上可呈现不同外观。</w:t>
+      </w:r>
+    </w:p>
+    <w:p>
+      <w:pPr>
+        <w:ind w:leftChars="200" w:left="440"/>
+        <w:rPr>
+          <w:sz w:val="28"/>
+          <w:szCs w:val="28"/>
+        </w:rPr>
+      </w:pPr>
+      <w:r>
+        <w:rPr>
+          <w:rFonts w:hint="eastAsia"/>
+          <w:sz w:val="28"/>
+          <w:szCs w:val="28"/>
+        </w:rPr>
+        <w:lastRenderedPageBreak/>
+        <w:t>Hitbox</w:t>
+      </w:r>
+    </w:p>
+    <w:p>
+      <w:pPr>
+        <w:ind w:leftChars="200" w:left="440"/>
+        <w:rPr>
+          <w:szCs w:val="22"/>
+        </w:rPr>
+      </w:pPr>
+      <w:r>
+        <w:rPr>
+          <w:rFonts w:hint="eastAsia"/>
+          <w:szCs w:val="22"/>
+        </w:rPr>
+        <w:t>在最初版游戏中所有类人形态单位为单一球体Hitbox，不分部位。后续可能会更新不同部位效果。</w:t>
+      </w:r>
+    </w:p>
+    <w:p>
+      <w:pPr>
+        <w:ind w:leftChars="200" w:left="440"/>
+        <w:rPr>
+          <w:b/>
+          <w:bCs/>
+          <w:sz w:val="32"/>
+          <w:szCs w:val="32"/>
+        </w:rPr>
+      </w:pPr>
+      <w:r>
+        <w:rPr>
+          <w:rFonts w:hint="eastAsia"/>
+          <w:b/>
+          <w:bCs/>
+          <w:sz w:val="32"/>
+          <w:szCs w:val="32"/>
+        </w:rPr>
+        <w:t>1.2.3人物动画</w:t>
+      </w:r>
+    </w:p>
+    <w:p>
+      <w:pPr>
+        <w:widowControl/>
+        <w:rPr>
+          <w:rFonts w:hint="eastAsia"/>
+          <w:b/>
+          <w:bCs/>
+          <w:sz w:val="32"/>
+          <w:szCs w:val="32"/>
+        </w:rPr>
+      </w:pPr>
+      <w:r>
+        <w:rPr>
+          <w:b/>
+          <w:bCs/>
+          <w:sz w:val="32"/>
+          <w:szCs w:val="32"/>
+        </w:rPr>
+        <w:br w:type="page"/>
+      </w:r>
+    </w:p>
+    <w:p>
+      <w:pPr>
+        <w:rPr>
+          <w:sz w:val="40"/>
+          <w:szCs w:val="40"/>
+        </w:rPr>
+      </w:pPr>
+      <w:r>
+        <w:rPr>
+          <w:rFonts w:hint="eastAsia"/>
+          <w:sz w:val="40"/>
+          <w:szCs w:val="40"/>
+        </w:rPr>
+        <w:lastRenderedPageBreak/>
+        <w:t>1.3装备</w:t>
+      </w:r>
+    </w:p>
+    <w:p>
+      <w:pPr>
+        <w:ind w:leftChars="200" w:left="440"/>
+        <w:rPr>
+          <w:b/>
+          <w:bCs/>
+          <w:sz w:val="32"/>
+          <w:szCs w:val="32"/>
+        </w:rPr>
+      </w:pPr>
+      <w:r>
+        <w:rPr>
+          <w:rFonts w:hint="eastAsia"/>
+          <w:b/>
+          <w:bCs/>
+          <w:sz w:val="32"/>
+          <w:szCs w:val="32"/>
+        </w:rPr>
+        <w:t>1.3.1稀有度</w:t>
+      </w:r>
+    </w:p>
+    <w:p>
+      <w:pPr>
+        <w:ind w:leftChars="200" w:left="440"/>
+        <w:rPr>
+          <w:rFonts w:hint="eastAsia"/>
+          <w:color w:val="000000" w:themeColor="text1"/>
+          <w:szCs w:val="22"/>
+        </w:rPr>
+      </w:pPr>
+      <w:r>
+        <w:rPr>
+          <w:rFonts w:hint="eastAsia"/>
+          <w:szCs w:val="22"/>
+        </w:rPr>
+        <w:t xml:space="preserve">所有装备分 </w:t>
+      </w:r>
+      <w:r>
+        <w:rPr>
+          <w:rFonts w:hint="eastAsia"/>
+          <w:color w:val="747474" w:themeColor="background2" w:themeShade="80"/>
+          <w:szCs w:val="22"/>
+        </w:rPr>
+        <w:t>白</w:t>
+      </w:r>
+      <w:r>
+        <w:rPr>
+          <w:rFonts w:hint="eastAsia"/>
+          <w:szCs w:val="22"/>
+        </w:rPr>
+        <w:t>/</w:t>
+      </w:r>
+      <w:r>
+        <w:rPr>
+          <w:rFonts w:hint="eastAsia"/>
+          <w:color w:val="00B050"/>
+          <w:szCs w:val="22"/>
+        </w:rPr>
+        <w:t>绿</w:t>
+      </w:r>
+      <w:r>
+        <w:rPr>
+          <w:rFonts w:hint="eastAsia"/>
+          <w:szCs w:val="22"/>
+        </w:rPr>
+        <w:t>/</w:t>
+      </w:r>
+      <w:r>
+        <w:rPr>
+          <w:rFonts w:hint="eastAsia"/>
+          <w:color w:val="00B0F0"/>
+          <w:szCs w:val="22"/>
+        </w:rPr>
+        <w:t>蓝</w:t>
+      </w:r>
+      <w:r>
+        <w:rPr>
+          <w:rFonts w:hint="eastAsia"/>
+          <w:szCs w:val="22"/>
+        </w:rPr>
+        <w:t>/</w:t>
+      </w:r>
+      <w:r>
+        <w:rPr>
+          <w:rFonts w:hint="eastAsia"/>
+          <w:color w:val="7030A0"/>
+          <w:szCs w:val="22"/>
+        </w:rPr>
+        <w:t>紫</w:t>
+      </w:r>
+      <w:r>
+        <w:rPr>
+          <w:rFonts w:hint="eastAsia"/>
+          <w:szCs w:val="22"/>
+        </w:rPr>
+        <w:t>/</w:t>
+      </w:r>
+      <w:r>
+        <w:rPr>
+          <w:rFonts w:hint="eastAsia"/>
+          <w:color w:val="FFC000"/>
+          <w:szCs w:val="22"/>
+        </w:rPr>
+        <w:t>黄</w:t>
+      </w:r>
+      <w:r>
+        <w:rPr>
+          <w:rFonts w:hint="eastAsia"/>
+          <w:szCs w:val="22"/>
+        </w:rPr>
+        <w:t>/</w:t>
+      </w:r>
+      <w:r>
+        <w:rPr>
+          <w:rFonts w:hint="eastAsia"/>
+          <w:color w:val="EE0000"/>
+          <w:szCs w:val="22"/>
+        </w:rPr>
+        <w:t>红</w:t>
+      </w:r>
+      <w:r>
+        <w:rPr>
+          <w:rFonts w:hint="eastAsia"/>
+          <w:color w:val="EE0000"/>
+          <w:szCs w:val="22"/>
+        </w:rPr>
+        <w:t xml:space="preserve"> </w:t>
+      </w:r>
+      <w:r>
+        <w:rPr>
+          <w:rFonts w:hint="eastAsia"/>
+          <w:color w:val="000000" w:themeColor="text1"/>
+          <w:szCs w:val="22"/>
+        </w:rPr>
+        <w:t>稀有度从低到高。</w:t>
+      </w:r>
+    </w:p>
+    <w:p>
+      <w:pPr>
+        <w:ind w:leftChars="200" w:left="440"/>
+        <w:rPr>
+          <w:color w:val="000000" w:themeColor="text1"/>
+          <w:szCs w:val="22"/>
+        </w:rPr>
+      </w:pPr>
+      <w:r>
+        <w:rPr>
+          <w:rFonts w:hint="eastAsia"/>
+          <w:color w:val="000000" w:themeColor="text1"/>
+          <w:szCs w:val="22"/>
+        </w:rPr>
+        <w:t>稀有度和获取难度强相关，和强度有关但关系不大。</w:t>
+      </w:r>
+    </w:p>
+    <w:p>
+      <w:pPr>
+        <w:ind w:leftChars="200" w:left="440"/>
+        <w:rPr>
+          <w:b/>
+          <w:bCs/>
+          <w:sz w:val="32"/>
+          <w:szCs w:val="32"/>
+        </w:rPr>
+      </w:pPr>
+      <w:r>
+        <w:rPr>
+          <w:rFonts w:hint="eastAsia"/>
+          <w:b/>
+          <w:bCs/>
+          <w:sz w:val="32"/>
+          <w:szCs w:val="32"/>
+        </w:rPr>
+        <w:t>1.3.2护甲</w:t>
+      </w:r>
+    </w:p>
+    <w:p>
+      <w:pPr>
+        <w:ind w:leftChars="200" w:left="440"/>
+        <w:rPr>
+          <w:sz w:val="28"/>
+          <w:szCs w:val="28"/>
+        </w:rPr>
+      </w:pPr>
+      <w:r>
+        <w:rPr>
+          <w:rFonts w:hint="eastAsia"/>
+          <w:sz w:val="28"/>
+          <w:szCs w:val="28"/>
+        </w:rPr>
+        <w:t>类型</w:t>
+      </w:r>
+    </w:p>
+    <w:p>
+      <w:pPr>
+        <w:ind w:leftChars="200" w:left="440"/>
+        <w:rPr>
+          <w:szCs w:val="22"/>
+        </w:rPr>
+      </w:pPr>
+      <w:r>
+        <w:rPr>
+          <w:rFonts w:hint="eastAsia"/>
+          <w:szCs w:val="22"/>
+        </w:rPr>
+        <w:t>护甲</w:t>
+      </w:r>
+      <w:r>
+        <w:rPr>
+          <w:rFonts w:hint="eastAsia"/>
+          <w:szCs w:val="22"/>
+        </w:rPr>
+        <w:t>按重量</w:t>
+      </w:r>
+      <w:r>
+        <w:rPr>
+          <w:rFonts w:hint="eastAsia"/>
+          <w:szCs w:val="22"/>
+        </w:rPr>
+        <w:t>分</w:t>
+      </w:r>
+      <w:r>
+        <w:rPr>
+          <w:rFonts w:hint="eastAsia"/>
+          <w:szCs w:val="22"/>
+        </w:rPr>
+        <w:t>服装/轻甲/中甲/重甲</w:t>
+      </w:r>
+    </w:p>
+    <w:p>
+      <w:pPr>
+        <w:ind w:leftChars="200" w:left="440"/>
+        <w:rPr>
+          <w:rFonts w:hint="eastAsia"/>
+          <w:szCs w:val="22"/>
+        </w:rPr>
+      </w:pPr>
+    </w:p>
+    <w:p>
+      <w:pPr>
+        <w:ind w:leftChars="200" w:left="440"/>
+        <w:rPr>
+          <w:sz w:val="28"/>
+          <w:szCs w:val="28"/>
+        </w:rPr>
+      </w:pPr>
+      <w:r>
+        <w:rPr>
+          <w:rFonts w:hint="eastAsia"/>
+          <w:sz w:val="28"/>
+          <w:szCs w:val="28"/>
+        </w:rPr>
+        <w:t>插槽</w:t>
+      </w:r>
+    </w:p>
+    <w:p>
+      <w:pPr>
+        <w:ind w:leftChars="200" w:left="440"/>
+        <w:rPr>
+          <w:sz w:val="28"/>
+          <w:szCs w:val="28"/>
+        </w:rPr>
+      </w:pPr>
+      <w:r>
+        <w:rPr>
+          <w:rFonts w:hint="eastAsia"/>
+          <w:sz w:val="28"/>
+          <w:szCs w:val="28"/>
+        </w:rPr>
+        <w:t>基础数值与补正方式</w:t>
+      </w:r>
+    </w:p>
+    <w:p>
+      <w:pPr>
+        <w:ind w:leftChars="200" w:left="440"/>
+        <w:rPr>
+          <w:sz w:val="28"/>
+          <w:szCs w:val="28"/>
+        </w:rPr>
+      </w:pPr>
+      <w:r>
+        <w:rPr>
+          <w:rFonts w:hint="eastAsia"/>
+          <w:sz w:val="28"/>
+          <w:szCs w:val="28"/>
+        </w:rPr>
+        <w:t>套装效果</w:t>
+      </w:r>
+    </w:p>
+    <w:p>
+      <w:pPr>
+        <w:ind w:leftChars="200" w:left="440"/>
+        <w:rPr>
+          <w:rFonts w:hint="eastAsia"/>
+          <w:szCs w:val="22"/>
+        </w:rPr>
+      </w:pPr>
     </w:p>
     <w:sectPr>
       <w:pgSz w:w="11906" w:h="16838"/>

</xml_diff>

<commit_message>
Update Marginal Planet’s Mini World 游戏项目设计方案.docx
</commit_message>
<xml_diff>
--- a/Docs/Marginal Planet’s Mini World 游戏项目设计方案.docx
+++ b/Docs/Marginal Planet’s Mini World 游戏项目设计方案.docx
@@ -67,11 +67,10 @@
       </w:r>
       <w:r>
         <w:rPr>
-          <w:rFonts w:hint="eastAsia"/>
           <w:i/>
           <w:iCs/>
         </w:rPr>
-        <w:t>2</w:t>
+        <w:t>3</w:t>
       </w:r>
     </w:p>
     <w:p>
@@ -1965,7 +1964,6 @@
       <w:pPr>
         <w:ind w:leftChars="200" w:left="440"/>
         <w:rPr>
-          <w:rFonts w:hint="eastAsia"/>
           <w:color w:val="000000" w:themeColor="text1"/>
           <w:sz w:val="20"/>
           <w:szCs w:val="20"/>
@@ -1979,7 +1977,7 @@
           <w:szCs w:val="16"/>
         </w:rPr>
         <w:drawing>
-          <wp:inline distT="0" distB="0" distL="0" distR="0" wp14:anchorId="1112A8B2" wp14:editId="6B97E95B">
+          <wp:inline distT="0" distB="0" distL="0" distR="0" wp14:anchorId="1112A8B2" wp14:editId="09BC30A0">
             <wp:extent cx="5263515" cy="1347470"/>
             <wp:effectExtent l="0" t="0" r="0" b="5080"/>
             <wp:docPr id="619230378" name="图片 2"/>
@@ -2033,6 +2031,27 @@
         <w:ind w:leftChars="200" w:left="440"/>
         <w:rPr>
           <w:rFonts w:hint="eastAsia"/>
+          <w:color w:val="00B0F0"/>
+          <w:sz w:val="16"/>
+          <w:szCs w:val="16"/>
+        </w:rPr>
+      </w:pPr>
+      <w:proofErr w:type="spellStart"/>
+      <w:r>
+        <w:rPr>
+          <w:rFonts w:hint="eastAsia"/>
+          <w:color w:val="00B0F0"/>
+          <w:sz w:val="16"/>
+          <w:szCs w:val="16"/>
+        </w:rPr>
+        <w:t>GDScript</w:t>
+      </w:r>
+      <w:proofErr w:type="spellEnd"/>
+    </w:p>
+    <w:p>
+      <w:pPr>
+        <w:ind w:leftChars="200" w:left="440"/>
+        <w:rPr>
           <w:b/>
           <w:bCs/>
           <w:sz w:val="32"/>
@@ -2047,64 +2066,160 @@
           <w:sz w:val="32"/>
           <w:szCs w:val="32"/>
         </w:rPr>
-        <w:t>1.1.3平台与地形限制</w:t>
-      </w:r>
-    </w:p>
-    <w:p>
-      <w:pPr>
-        <w:ind w:leftChars="200" w:left="440"/>
-        <w:rPr>
-          <w:rFonts w:hint="eastAsia"/>
-          <w:szCs w:val="22"/>
-        </w:rPr>
-      </w:pPr>
-      <w:r>
-        <w:rPr>
-          <w:rFonts w:hint="eastAsia"/>
-          <w:szCs w:val="22"/>
-        </w:rPr>
-        <w:t>确保所有实际地形位置可到达。</w:t>
-      </w:r>
-    </w:p>
-    <w:p>
-      <w:pPr>
-        <w:ind w:leftChars="200" w:left="440"/>
-        <w:rPr>
-          <w:rFonts w:hint="eastAsia"/>
-          <w:szCs w:val="22"/>
-        </w:rPr>
-      </w:pPr>
-      <w:r>
-        <w:rPr>
-          <w:rFonts w:hint="eastAsia"/>
-          <w:szCs w:val="22"/>
-        </w:rPr>
-        <w:t>在最初版本中没有增加跳跃高度的装备。单个平台高度不大于跳跃高度。</w:t>
-      </w:r>
-    </w:p>
-    <w:p>
-      <w:pPr>
-        <w:ind w:leftChars="200" w:left="440"/>
-        <w:rPr>
-          <w:rFonts w:hint="eastAsia"/>
-          <w:sz w:val="20"/>
-          <w:szCs w:val="20"/>
-        </w:rPr>
-      </w:pPr>
-      <w:r>
-        <w:rPr>
-          <w:rFonts w:hint="eastAsia"/>
-          <w:sz w:val="20"/>
-          <w:szCs w:val="20"/>
-        </w:rPr>
-        <w:t>实现方法：在每个关卡设计完成之后，通过一遍</w:t>
-      </w:r>
-    </w:p>
-    <w:p>
-      <w:pPr>
-        <w:ind w:leftChars="200" w:left="440"/>
-        <w:rPr>
-          <w:rFonts w:hint="eastAsia"/>
+        <w:t>地块构筑方式</w:t>
+      </w:r>
+    </w:p>
+    <w:p>
+      <w:pPr>
+        <w:ind w:leftChars="200" w:left="440"/>
+        <w:rPr>
+          <w:b/>
+          <w:bCs/>
+          <w:szCs w:val="22"/>
+        </w:rPr>
+      </w:pPr>
+      <w:proofErr w:type="spellStart"/>
+      <w:r>
+        <w:rPr>
+          <w:b/>
+          <w:bCs/>
+          <w:szCs w:val="22"/>
+        </w:rPr>
+        <w:t>TileMapLayer</w:t>
+      </w:r>
+      <w:proofErr w:type="spellEnd"/>
+    </w:p>
+    <w:p>
+      <w:pPr>
+        <w:ind w:leftChars="200" w:left="440"/>
+        <w:rPr>
+          <w:szCs w:val="22"/>
+        </w:rPr>
+      </w:pPr>
+      <w:r>
+        <w:rPr>
+          <w:rFonts w:hint="eastAsia"/>
+          <w:szCs w:val="22"/>
+        </w:rPr>
+        <w:t>这是一个很常见的构建2D地图的方法</w:t>
+      </w:r>
+    </w:p>
+    <w:p>
+      <w:pPr>
+        <w:ind w:leftChars="200" w:left="440"/>
+        <w:rPr>
+          <w:rFonts w:hint="eastAsia"/>
+          <w:szCs w:val="22"/>
+        </w:rPr>
+      </w:pPr>
+      <w:r>
+        <w:rPr>
+          <w:rFonts w:hint="eastAsia"/>
+          <w:szCs w:val="22"/>
+        </w:rPr>
+        <w:t>我们将在网格上绘制不同</w:t>
+      </w:r>
+      <w:proofErr w:type="gramStart"/>
+      <w:r>
+        <w:rPr>
+          <w:rFonts w:hint="eastAsia"/>
+          <w:szCs w:val="22"/>
+        </w:rPr>
+        <w:t>而图块来</w:t>
+      </w:r>
+      <w:proofErr w:type="gramEnd"/>
+      <w:r>
+        <w:rPr>
+          <w:rFonts w:hint="eastAsia"/>
+          <w:szCs w:val="22"/>
+        </w:rPr>
+        <w:t>创建我们的世界。这是一个很好的工作方式，因为我们可以重复利用许多方块来搭建不同的关卡。砖（Tile）一般会打包在一张图片里，就像玩家</w:t>
+      </w:r>
+      <w:proofErr w:type="gramStart"/>
+      <w:r>
+        <w:rPr>
+          <w:rFonts w:hint="eastAsia"/>
+          <w:szCs w:val="22"/>
+        </w:rPr>
+        <w:t>立绘表</w:t>
+      </w:r>
+      <w:proofErr w:type="gramEnd"/>
+      <w:r>
+        <w:rPr>
+          <w:rFonts w:hint="eastAsia"/>
+          <w:szCs w:val="22"/>
+        </w:rPr>
+        <w:t>一样。</w:t>
+      </w:r>
+      <w:proofErr w:type="gramStart"/>
+      <w:r>
+        <w:rPr>
+          <w:rFonts w:hint="eastAsia"/>
+          <w:szCs w:val="22"/>
+        </w:rPr>
+        <w:t>叫砖集</w:t>
+      </w:r>
+      <w:proofErr w:type="gramEnd"/>
+      <w:r>
+        <w:rPr>
+          <w:rFonts w:hint="eastAsia"/>
+          <w:szCs w:val="22"/>
+        </w:rPr>
+        <w:t>（</w:t>
+      </w:r>
+      <w:proofErr w:type="spellStart"/>
+      <w:r>
+        <w:rPr>
+          <w:rFonts w:hint="eastAsia"/>
+          <w:szCs w:val="22"/>
+        </w:rPr>
+        <w:t>TileSet</w:t>
+      </w:r>
+      <w:proofErr w:type="spellEnd"/>
+      <w:r>
+        <w:rPr>
+          <w:rFonts w:hint="eastAsia"/>
+          <w:szCs w:val="22"/>
+        </w:rPr>
+        <w:t>）</w:t>
+      </w:r>
+      <w:proofErr w:type="gramStart"/>
+      <w:r>
+        <w:rPr>
+          <w:rFonts w:hint="eastAsia"/>
+          <w:szCs w:val="22"/>
+        </w:rPr>
+        <w:t>而砖图</w:t>
+      </w:r>
+      <w:proofErr w:type="gramEnd"/>
+      <w:r>
+        <w:rPr>
+          <w:rFonts w:hint="eastAsia"/>
+          <w:szCs w:val="22"/>
+        </w:rPr>
+        <w:t>（</w:t>
+      </w:r>
+      <w:proofErr w:type="spellStart"/>
+      <w:r>
+        <w:rPr>
+          <w:rFonts w:hint="eastAsia"/>
+          <w:szCs w:val="22"/>
+        </w:rPr>
+        <w:t>TileMap</w:t>
+      </w:r>
+      <w:proofErr w:type="spellEnd"/>
+      <w:r>
+        <w:rPr>
+          <w:rFonts w:hint="eastAsia"/>
+          <w:szCs w:val="22"/>
+        </w:rPr>
+        <w:t>）用来在世界中绘制这些节点。</w:t>
+      </w:r>
+    </w:p>
+    <w:p>
+      <w:pPr>
+        <w:ind w:leftChars="200" w:left="440"/>
+        <w:rPr>
           <w:b/>
           <w:bCs/>
           <w:sz w:val="32"/>
@@ -2116,9 +2231,207 @@
           <w:rFonts w:hint="eastAsia"/>
           <w:b/>
           <w:bCs/>
+          <w:noProof/>
           <w:sz w:val="32"/>
           <w:szCs w:val="32"/>
         </w:rPr>
+        <w:drawing>
+          <wp:inline distT="0" distB="0" distL="0" distR="0" wp14:anchorId="75F130B1" wp14:editId="79A12C24">
+            <wp:extent cx="3240157" cy="1812461"/>
+            <wp:effectExtent l="0" t="0" r="0" b="0"/>
+            <wp:docPr id="923070460" name="图片 2"/>
+            <wp:cNvGraphicFramePr>
+              <a:graphicFrameLocks xmlns:a="http://schemas.openxmlformats.org/drawingml/2006/main" noChangeAspect="1"/>
+            </wp:cNvGraphicFramePr>
+            <a:graphic xmlns:a="http://schemas.openxmlformats.org/drawingml/2006/main">
+              <a:graphicData uri="http://schemas.openxmlformats.org/drawingml/2006/picture">
+                <pic:pic xmlns:pic="http://schemas.openxmlformats.org/drawingml/2006/picture">
+                  <pic:nvPicPr>
+                    <pic:cNvPr id="923070460" name="图片 923070460"/>
+                    <pic:cNvPicPr/>
+                  </pic:nvPicPr>
+                  <pic:blipFill>
+                    <a:blip r:embed="rId9">
+                      <a:extLst>
+                        <a:ext uri="{28A0092B-C50C-407E-A947-70E740481C1C}">
+                          <a14:useLocalDpi xmlns:a14="http://schemas.microsoft.com/office/drawing/2010/main" val="0"/>
+                        </a:ext>
+                      </a:extLst>
+                    </a:blip>
+                    <a:stretch>
+                      <a:fillRect/>
+                    </a:stretch>
+                  </pic:blipFill>
+                  <pic:spPr>
+                    <a:xfrm>
+                      <a:off x="0" y="0"/>
+                      <a:ext cx="3326271" cy="1860631"/>
+                    </a:xfrm>
+                    <a:prstGeom prst="rect">
+                      <a:avLst/>
+                    </a:prstGeom>
+                  </pic:spPr>
+                </pic:pic>
+              </a:graphicData>
+            </a:graphic>
+          </wp:inline>
+        </w:drawing>
+      </w:r>
+    </w:p>
+    <w:p>
+      <w:pPr>
+        <w:ind w:leftChars="200" w:left="440"/>
+        <w:rPr>
+          <w:rFonts w:hint="eastAsia"/>
+          <w:b/>
+          <w:bCs/>
+          <w:sz w:val="32"/>
+          <w:szCs w:val="32"/>
+        </w:rPr>
+      </w:pPr>
+      <w:r>
+        <w:rPr>
+          <w:rFonts w:hint="eastAsia"/>
+          <w:b/>
+          <w:bCs/>
+          <w:noProof/>
+          <w:sz w:val="32"/>
+          <w:szCs w:val="32"/>
+        </w:rPr>
+        <w:lastRenderedPageBreak/>
+        <w:drawing>
+          <wp:inline distT="0" distB="0" distL="0" distR="0" wp14:anchorId="32BDD73A" wp14:editId="40BC0FF0">
+            <wp:extent cx="5274310" cy="2607945"/>
+            <wp:effectExtent l="0" t="0" r="2540" b="1905"/>
+            <wp:docPr id="1079070357" name="图片 3"/>
+            <wp:cNvGraphicFramePr>
+              <a:graphicFrameLocks xmlns:a="http://schemas.openxmlformats.org/drawingml/2006/main" noChangeAspect="1"/>
+            </wp:cNvGraphicFramePr>
+            <a:graphic xmlns:a="http://schemas.openxmlformats.org/drawingml/2006/main">
+              <a:graphicData uri="http://schemas.openxmlformats.org/drawingml/2006/picture">
+                <pic:pic xmlns:pic="http://schemas.openxmlformats.org/drawingml/2006/picture">
+                  <pic:nvPicPr>
+                    <pic:cNvPr id="1079070357" name="图片 1079070357"/>
+                    <pic:cNvPicPr/>
+                  </pic:nvPicPr>
+                  <pic:blipFill>
+                    <a:blip r:embed="rId10" cstate="print">
+                      <a:extLst>
+                        <a:ext uri="{28A0092B-C50C-407E-A947-70E740481C1C}">
+                          <a14:useLocalDpi xmlns:a14="http://schemas.microsoft.com/office/drawing/2010/main" val="0"/>
+                        </a:ext>
+                      </a:extLst>
+                    </a:blip>
+                    <a:stretch>
+                      <a:fillRect/>
+                    </a:stretch>
+                  </pic:blipFill>
+                  <pic:spPr>
+                    <a:xfrm>
+                      <a:off x="0" y="0"/>
+                      <a:ext cx="5274310" cy="2607945"/>
+                    </a:xfrm>
+                    <a:prstGeom prst="rect">
+                      <a:avLst/>
+                    </a:prstGeom>
+                  </pic:spPr>
+                </pic:pic>
+              </a:graphicData>
+            </a:graphic>
+          </wp:inline>
+        </w:drawing>
+      </w:r>
+    </w:p>
+    <w:p>
+      <w:pPr>
+        <w:ind w:leftChars="200" w:left="440"/>
+        <w:rPr>
+          <w:b/>
+          <w:bCs/>
+          <w:sz w:val="32"/>
+          <w:szCs w:val="32"/>
+        </w:rPr>
+      </w:pPr>
+      <w:r>
+        <w:rPr>
+          <w:rFonts w:hint="eastAsia"/>
+          <w:b/>
+          <w:bCs/>
+          <w:sz w:val="32"/>
+          <w:szCs w:val="32"/>
+        </w:rPr>
+        <w:t>1.1.3平台与地形限制</w:t>
+      </w:r>
+    </w:p>
+    <w:p>
+      <w:pPr>
+        <w:ind w:leftChars="200" w:left="440"/>
+        <w:rPr>
+          <w:rFonts w:hint="eastAsia"/>
+          <w:szCs w:val="22"/>
+        </w:rPr>
+      </w:pPr>
+      <w:r>
+        <w:rPr>
+          <w:rFonts w:hint="eastAsia"/>
+          <w:szCs w:val="22"/>
+        </w:rPr>
+        <w:t>确保所有实际地形位置可到达。</w:t>
+      </w:r>
+    </w:p>
+    <w:p>
+      <w:pPr>
+        <w:ind w:leftChars="200" w:left="440"/>
+        <w:rPr>
+          <w:rFonts w:hint="eastAsia"/>
+          <w:szCs w:val="22"/>
+        </w:rPr>
+      </w:pPr>
+      <w:r>
+        <w:rPr>
+          <w:rFonts w:hint="eastAsia"/>
+          <w:szCs w:val="22"/>
+        </w:rPr>
+        <w:t>在最初版本中没有增加跳跃高度的装备。单个平台高度不大于跳跃高度。</w:t>
+      </w:r>
+    </w:p>
+    <w:p>
+      <w:pPr>
+        <w:ind w:leftChars="200" w:left="440"/>
+        <w:rPr>
+          <w:rFonts w:hint="eastAsia"/>
+          <w:sz w:val="20"/>
+          <w:szCs w:val="20"/>
+        </w:rPr>
+      </w:pPr>
+      <w:r>
+        <w:rPr>
+          <w:rFonts w:hint="eastAsia"/>
+          <w:sz w:val="20"/>
+          <w:szCs w:val="20"/>
+        </w:rPr>
+        <w:t>实现方法：在每个关卡设计完成之后，通过一遍</w:t>
+      </w:r>
+    </w:p>
+    <w:p>
+      <w:pPr>
+        <w:ind w:leftChars="200" w:left="440"/>
+        <w:rPr>
+          <w:rFonts w:hint="eastAsia"/>
+          <w:b/>
+          <w:bCs/>
+          <w:sz w:val="32"/>
+          <w:szCs w:val="32"/>
+        </w:rPr>
+      </w:pPr>
+      <w:r>
+        <w:rPr>
+          <w:rFonts w:hint="eastAsia"/>
+          <w:b/>
+          <w:bCs/>
+          <w:sz w:val="32"/>
+          <w:szCs w:val="32"/>
+        </w:rPr>
         <w:t>1.1.4效果地块</w:t>
       </w:r>
     </w:p>
@@ -2153,7 +2466,23 @@
           <w:rFonts w:hint="eastAsia"/>
           <w:szCs w:val="22"/>
         </w:rPr>
-        <w:t>这是一种会因与单位产生碰撞或交互对单位造成伤害的地块。</w:t>
+        <w:t>这是一种会因与单位产生碰撞或</w:t>
+      </w:r>
+      <w:proofErr w:type="gramStart"/>
+      <w:r>
+        <w:rPr>
+          <w:rFonts w:hint="eastAsia"/>
+          <w:szCs w:val="22"/>
+        </w:rPr>
+        <w:t>交互对</w:t>
+      </w:r>
+      <w:proofErr w:type="gramEnd"/>
+      <w:r>
+        <w:rPr>
+          <w:rFonts w:hint="eastAsia"/>
+          <w:szCs w:val="22"/>
+        </w:rPr>
+        <w:t>单位造成伤害的地块。</w:t>
       </w:r>
     </w:p>
     <w:p>
@@ -2237,7 +2566,6 @@
           <w:sz w:val="28"/>
           <w:szCs w:val="28"/>
         </w:rPr>
-        <w:lastRenderedPageBreak/>
         <w:t>特殊效果地块</w:t>
       </w:r>
     </w:p>
@@ -2288,6 +2616,7 @@
           <w:rFonts w:hint="eastAsia"/>
           <w:szCs w:val="22"/>
         </w:rPr>
+        <w:lastRenderedPageBreak/>
         <w:t>某些地形可被强拆毁值*的攻击破坏。</w:t>
       </w:r>
     </w:p>
@@ -2433,7 +2762,7 @@
                     </pic:cNvPicPr>
                   </pic:nvPicPr>
                   <pic:blipFill>
-                    <a:blip r:embed="rId9" cstate="print">
+                    <a:blip r:embed="rId11" cstate="print">
                       <a:extLst>
                         <a:ext uri="{28A0092B-C50C-407E-A947-70E740481C1C}">
                           <a14:useLocalDpi xmlns:a14="http://schemas.microsoft.com/office/drawing/2010/main" val="0"/>
@@ -2519,73 +2848,128 @@
           <w:rFonts w:hint="eastAsia"/>
           <w:szCs w:val="22"/>
         </w:rPr>
+        <w:t>例如一把大剑有45面板攻击，力量补正40%，敏捷补正10%。玩家力量10敏捷10</w:t>
+      </w:r>
+    </w:p>
+    <w:p>
+      <w:pPr>
+        <w:ind w:leftChars="200" w:left="440"/>
+        <w:rPr>
+          <w:rFonts w:hint="eastAsia"/>
+          <w:szCs w:val="22"/>
+        </w:rPr>
+      </w:pPr>
+      <w:r>
+        <w:rPr>
+          <w:rFonts w:hint="eastAsia"/>
+          <w:szCs w:val="22"/>
+        </w:rPr>
+        <w:t>最终面板45</w:t>
+      </w:r>
+      <w:r>
+        <w:rPr>
+          <w:rFonts w:hint="eastAsia"/>
+          <w:szCs w:val="22"/>
+        </w:rPr>
+        <w:t>+</w:t>
+      </w:r>
+      <w:r>
+        <w:rPr>
+          <w:szCs w:val="22"/>
+        </w:rPr>
+        <w:t>10</w:t>
+      </w:r>
+      <w:r>
+        <w:rPr>
+          <w:rFonts w:hint="eastAsia"/>
+          <w:szCs w:val="22"/>
+        </w:rPr>
+        <w:t>×</w:t>
+      </w:r>
+      <w:r>
+        <w:rPr>
+          <w:szCs w:val="22"/>
+        </w:rPr>
+        <w:t>0.4+</w:t>
+      </w:r>
+      <w:r>
+        <w:rPr>
+          <w:rFonts w:hint="eastAsia"/>
+          <w:szCs w:val="22"/>
+        </w:rPr>
+        <w:t>10×0.1=50</w:t>
+      </w:r>
+    </w:p>
+    <w:p>
+      <w:pPr>
+        <w:ind w:leftChars="200" w:left="440"/>
+        <w:rPr>
+          <w:rFonts w:hint="eastAsia"/>
+          <w:szCs w:val="22"/>
+        </w:rPr>
+      </w:pPr>
+      <w:r>
+        <w:rPr>
+          <w:rFonts w:hint="eastAsia"/>
+          <w:szCs w:val="22"/>
+        </w:rPr>
+        <w:t>多数武器存在一个</w:t>
+      </w:r>
+      <w:proofErr w:type="gramStart"/>
+      <w:r>
+        <w:rPr>
+          <w:rFonts w:hint="eastAsia"/>
+          <w:szCs w:val="22"/>
+        </w:rPr>
+        <w:t>可以可以</w:t>
+      </w:r>
+      <w:proofErr w:type="gramEnd"/>
+      <w:r>
+        <w:rPr>
+          <w:rFonts w:hint="eastAsia"/>
+          <w:szCs w:val="22"/>
+        </w:rPr>
+        <w:t>使用</w:t>
+      </w:r>
+      <w:proofErr w:type="gramStart"/>
+      <w:r>
+        <w:rPr>
+          <w:rFonts w:hint="eastAsia"/>
+          <w:szCs w:val="22"/>
+        </w:rPr>
+        <w:t>此武器</w:t>
+      </w:r>
+      <w:proofErr w:type="gramEnd"/>
+      <w:r>
+        <w:rPr>
+          <w:rFonts w:hint="eastAsia"/>
+          <w:szCs w:val="22"/>
+        </w:rPr>
+        <w:t>最小能力限制，例如一把大剑的最小能力限制是10力10敏。若玩家任意一个属性小于这个值使用此武器，</w:t>
+      </w:r>
+      <w:proofErr w:type="gramStart"/>
+      <w:r>
+        <w:rPr>
+          <w:rFonts w:hint="eastAsia"/>
+          <w:szCs w:val="22"/>
+        </w:rPr>
+        <w:t>则武器</w:t>
+      </w:r>
+      <w:proofErr w:type="gramEnd"/>
+      <w:r>
+        <w:rPr>
+          <w:rFonts w:hint="eastAsia"/>
+          <w:szCs w:val="22"/>
+        </w:rPr>
+        <w:t>性能会</w:t>
+      </w:r>
+      <w:r>
+        <w:rPr>
+          <w:rFonts w:hint="eastAsia"/>
+          <w:szCs w:val="22"/>
+        </w:rPr>
         <w:lastRenderedPageBreak/>
-        <w:t>例如一把大剑有45面板攻击，力量补正40%，敏捷补正10%。玩家力量10敏捷10</w:t>
-      </w:r>
-    </w:p>
-    <w:p>
-      <w:pPr>
-        <w:ind w:leftChars="200" w:left="440"/>
-        <w:rPr>
-          <w:rFonts w:hint="eastAsia"/>
-          <w:szCs w:val="22"/>
-        </w:rPr>
-      </w:pPr>
-      <w:r>
-        <w:rPr>
-          <w:rFonts w:hint="eastAsia"/>
-          <w:szCs w:val="22"/>
-        </w:rPr>
-        <w:t>最终面板45</w:t>
-      </w:r>
-      <w:r>
-        <w:rPr>
-          <w:rFonts w:hint="eastAsia"/>
-          <w:szCs w:val="22"/>
-        </w:rPr>
-        <w:t>+</w:t>
-      </w:r>
-      <w:r>
-        <w:rPr>
-          <w:szCs w:val="22"/>
-        </w:rPr>
-        <w:t>10</w:t>
-      </w:r>
-      <w:r>
-        <w:rPr>
-          <w:rFonts w:hint="eastAsia"/>
-          <w:szCs w:val="22"/>
-        </w:rPr>
-        <w:t>×</w:t>
-      </w:r>
-      <w:r>
-        <w:rPr>
-          <w:szCs w:val="22"/>
-        </w:rPr>
-        <w:t>0.4+</w:t>
-      </w:r>
-      <w:r>
-        <w:rPr>
-          <w:rFonts w:hint="eastAsia"/>
-          <w:szCs w:val="22"/>
-        </w:rPr>
-        <w:t>10×0.1=50</w:t>
-      </w:r>
-    </w:p>
-    <w:p>
-      <w:pPr>
-        <w:ind w:leftChars="200" w:left="440"/>
-        <w:rPr>
-          <w:rFonts w:hint="eastAsia"/>
-          <w:szCs w:val="22"/>
-        </w:rPr>
-      </w:pPr>
-      <w:r>
-        <w:rPr>
-          <w:rFonts w:hint="eastAsia"/>
-          <w:szCs w:val="22"/>
-        </w:rPr>
-        <w:t>多数武器存在一个可以可以使用此武器最小能力限制，例如一把大剑的最小能力限制是10力10敏。若玩家任意一个属性小于这个值使用此武器，则武器性能会大减</w:t>
+        <w:t>大减</w:t>
       </w:r>
       <w:r>
         <w:rPr>
@@ -2630,8 +3014,33 @@
           <w:rFonts w:hint="eastAsia"/>
           <w:szCs w:val="22"/>
         </w:rPr>
-        <w:t>人物外观统一为像素画风格，使用Resprite</w:t>
-      </w:r>
+        <w:t>人物外观统一为</w:t>
+      </w:r>
+      <w:proofErr w:type="gramStart"/>
+      <w:r>
+        <w:rPr>
+          <w:rFonts w:hint="eastAsia"/>
+          <w:szCs w:val="22"/>
+        </w:rPr>
+        <w:t>像素画</w:t>
+      </w:r>
+      <w:proofErr w:type="gramEnd"/>
+      <w:r>
+        <w:rPr>
+          <w:rFonts w:hint="eastAsia"/>
+          <w:szCs w:val="22"/>
+        </w:rPr>
+        <w:t>风格，使用</w:t>
+      </w:r>
+      <w:proofErr w:type="spellStart"/>
+      <w:r>
+        <w:rPr>
+          <w:rFonts w:hint="eastAsia"/>
+          <w:szCs w:val="22"/>
+        </w:rPr>
+        <w:t>Resprite</w:t>
+      </w:r>
+      <w:proofErr w:type="spellEnd"/>
       <w:r>
         <w:rPr>
           <w:rFonts w:hint="eastAsia"/>
@@ -2662,7 +3071,25 @@
           <w:sz w:val="16"/>
           <w:szCs w:val="16"/>
         </w:rPr>
-        <w:t>*Resprite绘制和美术风格设计会在美术章节详细讲解</w:t>
+        <w:t>*</w:t>
+      </w:r>
+      <w:proofErr w:type="spellStart"/>
+      <w:r>
+        <w:rPr>
+          <w:rFonts w:hint="eastAsia"/>
+          <w:sz w:val="16"/>
+          <w:szCs w:val="16"/>
+        </w:rPr>
+        <w:t>Resprite</w:t>
+      </w:r>
+      <w:proofErr w:type="spellEnd"/>
+      <w:r>
+        <w:rPr>
+          <w:rFonts w:hint="eastAsia"/>
+          <w:sz w:val="16"/>
+          <w:szCs w:val="16"/>
+        </w:rPr>
+        <w:t>绘制和美术风格设计会在美术章节详细讲解</w:t>
       </w:r>
     </w:p>
     <w:p>
@@ -2696,7 +3123,7 @@
                     </pic:cNvPicPr>
                   </pic:nvPicPr>
                   <pic:blipFill>
-                    <a:blip r:embed="rId10" cstate="print">
+                    <a:blip r:embed="rId12" cstate="print">
                       <a:extLst>
                         <a:ext uri="{28A0092B-C50C-407E-A947-70E740481C1C}">
                           <a14:useLocalDpi xmlns:a14="http://schemas.microsoft.com/office/drawing/2010/main" val="0"/>
@@ -2750,7 +3177,7 @@
                     </pic:cNvPicPr>
                   </pic:nvPicPr>
                   <pic:blipFill>
-                    <a:blip r:embed="rId11">
+                    <a:blip r:embed="rId13">
                       <a:extLst>
                         <a:ext uri="{28A0092B-C50C-407E-A947-70E740481C1C}">
                           <a14:useLocalDpi xmlns:a14="http://schemas.microsoft.com/office/drawing/2010/main" val="0"/>
@@ -2867,7 +3294,23 @@
           <w:rFonts w:hint="eastAsia"/>
           <w:szCs w:val="22"/>
         </w:rPr>
-        <w:t>在最初版游戏中所有类人形态单位为单一球体Hitbox，不分部位。后续可能会更新不同部位效果。</w:t>
+        <w:t>在</w:t>
+      </w:r>
+      <w:proofErr w:type="gramStart"/>
+      <w:r>
+        <w:rPr>
+          <w:rFonts w:hint="eastAsia"/>
+          <w:szCs w:val="22"/>
+        </w:rPr>
+        <w:t>最</w:t>
+      </w:r>
+      <w:proofErr w:type="gramEnd"/>
+      <w:r>
+        <w:rPr>
+          <w:rFonts w:hint="eastAsia"/>
+          <w:szCs w:val="22"/>
+        </w:rPr>
+        <w:t>初版游戏中所有类人形态单位为单一球体Hitbox，不分部位。后续可能会更新不同部位效果。</w:t>
       </w:r>
     </w:p>
     <w:p>
@@ -2901,7 +3344,7 @@
                     </pic:cNvPicPr>
                   </pic:nvPicPr>
                   <pic:blipFill>
-                    <a:blip r:embed="rId12" cstate="print">
+                    <a:blip r:embed="rId14" cstate="print">
                       <a:extLst>
                         <a:ext uri="{28A0092B-C50C-407E-A947-70E740481C1C}">
                           <a14:useLocalDpi xmlns:a14="http://schemas.microsoft.com/office/drawing/2010/main" val="0"/>
@@ -2952,40 +3395,95 @@
           <w:sz w:val="32"/>
           <w:szCs w:val="32"/>
         </w:rPr>
+        <w:t>1.2.3人物动画</w:t>
+      </w:r>
+    </w:p>
+    <w:p>
+      <w:pPr>
+        <w:ind w:leftChars="200" w:left="440"/>
+        <w:rPr>
+          <w:rFonts w:hint="eastAsia"/>
+          <w:szCs w:val="22"/>
+        </w:rPr>
+      </w:pPr>
+      <w:r>
+        <w:rPr>
+          <w:rFonts w:hint="eastAsia"/>
+          <w:szCs w:val="22"/>
+        </w:rPr>
+        <w:t>实现方法：</w:t>
+      </w:r>
+      <w:proofErr w:type="gramStart"/>
+      <w:r>
+        <w:rPr>
+          <w:rFonts w:hint="eastAsia"/>
+          <w:szCs w:val="22"/>
+        </w:rPr>
+        <w:t>立绘表</w:t>
+      </w:r>
+      <w:proofErr w:type="gramEnd"/>
+      <w:r>
+        <w:rPr>
+          <w:rFonts w:hint="eastAsia"/>
+          <w:szCs w:val="22"/>
+        </w:rPr>
+        <w:t>。这是一种把人物各种动画打包进一张图的高效动画创作方法。相比于虚幻和Unity引擎的一帧</w:t>
+      </w:r>
+      <w:proofErr w:type="gramStart"/>
+      <w:r>
+        <w:rPr>
+          <w:rFonts w:hint="eastAsia"/>
+          <w:szCs w:val="22"/>
+        </w:rPr>
+        <w:t>一张立绘有效率</w:t>
+      </w:r>
+      <w:proofErr w:type="gramEnd"/>
+      <w:r>
+        <w:rPr>
+          <w:rFonts w:hint="eastAsia"/>
+          <w:szCs w:val="22"/>
+        </w:rPr>
+        <w:t>优势。</w:t>
+      </w:r>
+    </w:p>
+    <w:p>
+      <w:pPr>
+        <w:ind w:leftChars="200" w:left="440"/>
+        <w:rPr>
+          <w:rFonts w:hint="eastAsia"/>
+          <w:szCs w:val="22"/>
+        </w:rPr>
+      </w:pPr>
+      <w:r>
+        <w:rPr>
+          <w:rFonts w:hint="eastAsia"/>
+          <w:szCs w:val="22"/>
+        </w:rPr>
+        <w:t>通过绘制网格的方式</w:t>
+      </w:r>
+      <w:proofErr w:type="gramStart"/>
+      <w:r>
+        <w:rPr>
+          <w:rFonts w:hint="eastAsia"/>
+          <w:szCs w:val="22"/>
+        </w:rPr>
+        <w:t>将立绘表中</w:t>
+      </w:r>
+      <w:proofErr w:type="gramEnd"/>
+      <w:r>
+        <w:rPr>
+          <w:rFonts w:hint="eastAsia"/>
+          <w:szCs w:val="22"/>
+        </w:rPr>
+        <w:t>的图像拆分成帧。再通过鼠标选择导入要使用的</w:t>
+      </w:r>
+      <w:r>
+        <w:rPr>
+          <w:rFonts w:hint="eastAsia"/>
+          <w:szCs w:val="22"/>
+        </w:rPr>
         <w:lastRenderedPageBreak/>
-        <w:t>1.2.3人物动画</w:t>
-      </w:r>
-    </w:p>
-    <w:p>
-      <w:pPr>
-        <w:ind w:leftChars="200" w:left="440"/>
-        <w:rPr>
-          <w:rFonts w:hint="eastAsia"/>
-          <w:szCs w:val="22"/>
-        </w:rPr>
-      </w:pPr>
-      <w:r>
-        <w:rPr>
-          <w:rFonts w:hint="eastAsia"/>
-          <w:szCs w:val="22"/>
-        </w:rPr>
-        <w:t>实现方法：立绘表。这是一种把人物各种动画打包进一张图的高效动画创作方法。相比于虚幻和Unity引擎的一帧一张立绘有效率优势。</w:t>
-      </w:r>
-    </w:p>
-    <w:p>
-      <w:pPr>
-        <w:ind w:leftChars="200" w:left="440"/>
-        <w:rPr>
-          <w:rFonts w:hint="eastAsia"/>
-          <w:szCs w:val="22"/>
-        </w:rPr>
-      </w:pPr>
-      <w:r>
-        <w:rPr>
-          <w:rFonts w:hint="eastAsia"/>
-          <w:szCs w:val="22"/>
-        </w:rPr>
-        <w:t>通过绘制网格的方式将立绘表中的图像拆分成帧。再通过鼠标选择导入要使用的帧</w:t>
+        <w:t>帧</w:t>
       </w:r>
       <w:r>
         <w:rPr>
@@ -3011,7 +3509,7 @@
                     </pic:cNvPicPr>
                   </pic:nvPicPr>
                   <pic:blipFill>
-                    <a:blip r:embed="rId13" cstate="print">
+                    <a:blip r:embed="rId15" cstate="print">
                       <a:extLst>
                         <a:ext uri="{28A0092B-C50C-407E-A947-70E740481C1C}">
                           <a14:useLocalDpi xmlns:a14="http://schemas.microsoft.com/office/drawing/2010/main" val="0"/>
@@ -3053,6 +3551,7 @@
           <w:szCs w:val="16"/>
         </w:rPr>
       </w:pPr>
+      <w:proofErr w:type="gramStart"/>
       <w:r>
         <w:rPr>
           <w:rFonts w:hint="eastAsia"/>
@@ -3062,6 +3561,7 @@
         </w:rPr>
         <w:t>立绘表</w:t>
       </w:r>
+      <w:proofErr w:type="gramEnd"/>
     </w:p>
     <w:p>
       <w:pPr>
@@ -3098,7 +3598,7 @@
                     </pic:cNvPicPr>
                   </pic:nvPicPr>
                   <pic:blipFill>
-                    <a:blip r:embed="rId14">
+                    <a:blip r:embed="rId16">
                       <a:extLst>
                         <a:ext uri="{28A0092B-C50C-407E-A947-70E740481C1C}">
                           <a14:useLocalDpi xmlns:a14="http://schemas.microsoft.com/office/drawing/2010/main" val="0"/>
@@ -3147,8 +3647,19 @@
           <w:sz w:val="16"/>
           <w:szCs w:val="16"/>
         </w:rPr>
-        <w:t>选择帧</w:t>
-      </w:r>
+        <w:t>选择</w:t>
+      </w:r>
+      <w:proofErr w:type="gramStart"/>
+      <w:r>
+        <w:rPr>
+          <w:rFonts w:hint="eastAsia"/>
+          <w:color w:val="00B0F0"/>
+          <w:sz w:val="16"/>
+          <w:szCs w:val="16"/>
+        </w:rPr>
+        <w:t>帧</w:t>
+      </w:r>
+      <w:proofErr w:type="gramEnd"/>
     </w:p>
     <w:p>
       <w:pPr>
@@ -3170,7 +3681,6 @@
           <w:sz w:val="32"/>
           <w:szCs w:val="32"/>
         </w:rPr>
-        <w:lastRenderedPageBreak/>
         <w:drawing>
           <wp:inline distT="0" distB="0" distL="0" distR="0" wp14:anchorId="4AE3CABE" wp14:editId="502BD5D1">
             <wp:extent cx="4297680" cy="1974247"/>
@@ -3187,7 +3697,7 @@
                     <pic:cNvPicPr/>
                   </pic:nvPicPr>
                   <pic:blipFill>
-                    <a:blip r:embed="rId15">
+                    <a:blip r:embed="rId17">
                       <a:extLst>
                         <a:ext uri="{28A0092B-C50C-407E-A947-70E740481C1C}">
                           <a14:useLocalDpi xmlns:a14="http://schemas.microsoft.com/office/drawing/2010/main" val="0"/>
@@ -3234,6 +3744,7 @@
           <w:sz w:val="28"/>
           <w:szCs w:val="28"/>
         </w:rPr>
+        <w:lastRenderedPageBreak/>
         <w:t>物理交互</w:t>
       </w:r>
     </w:p>
@@ -3253,7 +3764,25 @@
           <w:sz w:val="20"/>
           <w:szCs w:val="20"/>
         </w:rPr>
-        <w:t>实现方法：GDscript中的</w:t>
+        <w:t>实现方法：</w:t>
+      </w:r>
+      <w:proofErr w:type="spellStart"/>
+      <w:r>
+        <w:rPr>
+          <w:rFonts w:hint="eastAsia"/>
+          <w:sz w:val="20"/>
+          <w:szCs w:val="20"/>
+        </w:rPr>
+        <w:t>GDscript</w:t>
+      </w:r>
+      <w:proofErr w:type="spellEnd"/>
+      <w:r>
+        <w:rPr>
+          <w:rFonts w:hint="eastAsia"/>
+          <w:sz w:val="20"/>
+          <w:szCs w:val="20"/>
+        </w:rPr>
+        <w:t>中的</w:t>
       </w:r>
       <w:r>
         <w:rPr>
@@ -3261,7 +3790,25 @@
           <w:sz w:val="20"/>
           <w:szCs w:val="20"/>
         </w:rPr>
-        <w:t>_physics_process()</w:t>
+        <w:t>_</w:t>
+      </w:r>
+      <w:proofErr w:type="spellStart"/>
+      <w:r>
+        <w:rPr>
+          <w:color w:val="0070C0"/>
+          <w:sz w:val="20"/>
+          <w:szCs w:val="20"/>
+        </w:rPr>
+        <w:t>physics_process</w:t>
+      </w:r>
+      <w:proofErr w:type="spellEnd"/>
+      <w:r>
+        <w:rPr>
+          <w:color w:val="0070C0"/>
+          <w:sz w:val="20"/>
+          <w:szCs w:val="20"/>
+        </w:rPr>
+        <w:t>()</w:t>
       </w:r>
       <w:r>
         <w:rPr>
@@ -3270,7 +3817,47 @@
           <w:sz w:val="20"/>
           <w:szCs w:val="20"/>
         </w:rPr>
-        <w:t>函数实现键位设置。这个函数会运行在一个固定帧率下，不受游戏帧率影响，以保证物理引擎能正确的模拟游戏内的物理运动。</w:t>
+        <w:t>函数实现键位设置。这个函数会运行在一个</w:t>
+      </w:r>
+      <w:proofErr w:type="gramStart"/>
+      <w:r>
+        <w:rPr>
+          <w:rFonts w:hint="eastAsia"/>
+          <w:color w:val="000000" w:themeColor="text1"/>
+          <w:sz w:val="20"/>
+          <w:szCs w:val="20"/>
+        </w:rPr>
+        <w:t>固定帧率下</w:t>
+      </w:r>
+      <w:proofErr w:type="gramEnd"/>
+      <w:r>
+        <w:rPr>
+          <w:rFonts w:hint="eastAsia"/>
+          <w:color w:val="000000" w:themeColor="text1"/>
+          <w:sz w:val="20"/>
+          <w:szCs w:val="20"/>
+        </w:rPr>
+        <w:t>，不受</w:t>
+      </w:r>
+      <w:proofErr w:type="gramStart"/>
+      <w:r>
+        <w:rPr>
+          <w:rFonts w:hint="eastAsia"/>
+          <w:color w:val="000000" w:themeColor="text1"/>
+          <w:sz w:val="20"/>
+          <w:szCs w:val="20"/>
+        </w:rPr>
+        <w:t>游戏帧率影响</w:t>
+      </w:r>
+      <w:proofErr w:type="gramEnd"/>
+      <w:r>
+        <w:rPr>
+          <w:rFonts w:hint="eastAsia"/>
+          <w:color w:val="000000" w:themeColor="text1"/>
+          <w:sz w:val="20"/>
+          <w:szCs w:val="20"/>
+        </w:rPr>
+        <w:t>，以保证物理引擎能正确的模拟游戏内的物理运动。</w:t>
       </w:r>
     </w:p>
     <w:p>
@@ -3310,7 +3897,7 @@
                     </pic:cNvPicPr>
                   </pic:nvPicPr>
                   <pic:blipFill>
-                    <a:blip r:embed="rId16" cstate="print">
+                    <a:blip r:embed="rId18" cstate="print">
                       <a:extLst>
                         <a:ext uri="{28A0092B-C50C-407E-A947-70E740481C1C}">
                           <a14:useLocalDpi xmlns:a14="http://schemas.microsoft.com/office/drawing/2010/main" val="0"/>
@@ -3395,7 +3982,23 @@
           <w:rFonts w:hint="eastAsia"/>
           <w:szCs w:val="22"/>
         </w:rPr>
-        <w:t xml:space="preserve">所有装备分 </w:t>
+        <w:t>所有</w:t>
+      </w:r>
+      <w:proofErr w:type="gramStart"/>
+      <w:r>
+        <w:rPr>
+          <w:rFonts w:hint="eastAsia"/>
+          <w:szCs w:val="22"/>
+        </w:rPr>
+        <w:t>装备分</w:t>
+      </w:r>
+      <w:proofErr w:type="gramEnd"/>
+      <w:r>
+        <w:rPr>
+          <w:rFonts w:hint="eastAsia"/>
+          <w:szCs w:val="22"/>
+        </w:rPr>
+        <w:t xml:space="preserve"> </w:t>
       </w:r>
       <w:r>
         <w:rPr>
@@ -3577,6 +4180,7 @@
         </w:rPr>
         <w:t>按重量</w:t>
       </w:r>
+      <w:proofErr w:type="gramStart"/>
       <w:r>
         <w:rPr>
           <w:rFonts w:hint="eastAsia"/>
@@ -3589,25 +4193,41 @@
           <w:rFonts w:hint="eastAsia"/>
           <w:szCs w:val="22"/>
         </w:rPr>
-        <w:t>服装/轻甲/中甲/重甲</w:t>
-      </w:r>
-    </w:p>
-    <w:p>
-      <w:pPr>
-        <w:ind w:leftChars="200" w:left="440"/>
-        <w:rPr>
-          <w:rFonts w:hint="eastAsia"/>
-          <w:szCs w:val="22"/>
-        </w:rPr>
-      </w:pPr>
-      <w:r>
-        <w:rPr>
-          <w:rFonts w:hint="eastAsia"/>
-          <w:szCs w:val="22"/>
-        </w:rPr>
-        <w:lastRenderedPageBreak/>
-        <w:t>按用途可分为时装和战装</w:t>
-      </w:r>
+        <w:t>服装/轻甲</w:t>
+      </w:r>
+      <w:proofErr w:type="gramEnd"/>
+      <w:r>
+        <w:rPr>
+          <w:rFonts w:hint="eastAsia"/>
+          <w:szCs w:val="22"/>
+        </w:rPr>
+        <w:t>/中甲/重甲</w:t>
+      </w:r>
+    </w:p>
+    <w:p>
+      <w:pPr>
+        <w:ind w:leftChars="200" w:left="440"/>
+        <w:rPr>
+          <w:rFonts w:hint="eastAsia"/>
+          <w:szCs w:val="22"/>
+        </w:rPr>
+      </w:pPr>
+      <w:r>
+        <w:rPr>
+          <w:rFonts w:hint="eastAsia"/>
+          <w:szCs w:val="22"/>
+        </w:rPr>
+        <w:t>按用途可分为时装和</w:t>
+      </w:r>
+      <w:proofErr w:type="gramStart"/>
+      <w:r>
+        <w:rPr>
+          <w:rFonts w:hint="eastAsia"/>
+          <w:szCs w:val="22"/>
+        </w:rPr>
+        <w:t>战装</w:t>
+      </w:r>
+      <w:proofErr w:type="gramEnd"/>
     </w:p>
     <w:p>
       <w:pPr>
@@ -3690,22 +4310,39 @@
           <w:rFonts w:hint="eastAsia"/>
           <w:szCs w:val="22"/>
         </w:rPr>
-        <w:t>护甲本身有防御力、护甲等级、魅力评分三个维度。</w:t>
-      </w:r>
-    </w:p>
-    <w:p>
-      <w:pPr>
-        <w:ind w:leftChars="200" w:left="440"/>
-        <w:rPr>
-          <w:rFonts w:hint="eastAsia"/>
-          <w:szCs w:val="22"/>
-        </w:rPr>
-      </w:pPr>
-      <w:r>
-        <w:rPr>
-          <w:rFonts w:hint="eastAsia"/>
-          <w:szCs w:val="22"/>
-        </w:rPr>
+        <w:t>护</w:t>
+      </w:r>
+      <w:proofErr w:type="gramStart"/>
+      <w:r>
+        <w:rPr>
+          <w:rFonts w:hint="eastAsia"/>
+          <w:szCs w:val="22"/>
+        </w:rPr>
+        <w:t>甲本身</w:t>
+      </w:r>
+      <w:proofErr w:type="gramEnd"/>
+      <w:r>
+        <w:rPr>
+          <w:rFonts w:hint="eastAsia"/>
+          <w:szCs w:val="22"/>
+        </w:rPr>
+        <w:t>有防御力、护甲等级、魅力评分三个维度。</w:t>
+      </w:r>
+    </w:p>
+    <w:p>
+      <w:pPr>
+        <w:ind w:leftChars="200" w:left="440"/>
+        <w:rPr>
+          <w:rFonts w:hint="eastAsia"/>
+          <w:szCs w:val="22"/>
+        </w:rPr>
+      </w:pPr>
+      <w:r>
+        <w:rPr>
+          <w:rFonts w:hint="eastAsia"/>
+          <w:szCs w:val="22"/>
+        </w:rPr>
+        <w:lastRenderedPageBreak/>
         <w:t>护甲的基础数值有：</w:t>
       </w:r>
     </w:p>
@@ -3722,8 +4359,17 @@
           <w:rFonts w:hint="eastAsia"/>
           <w:szCs w:val="22"/>
         </w:rPr>
-        <w:t>防御力：决定物理减伤率</w:t>
-      </w:r>
+        <w:t>防御力：决定物理</w:t>
+      </w:r>
+      <w:proofErr w:type="gramStart"/>
+      <w:r>
+        <w:rPr>
+          <w:rFonts w:hint="eastAsia"/>
+          <w:szCs w:val="22"/>
+        </w:rPr>
+        <w:t>减伤率</w:t>
+      </w:r>
+      <w:proofErr w:type="gramEnd"/>
     </w:p>
     <w:p>
       <w:pPr>
@@ -3902,7 +4548,23 @@
           <w:rFonts w:hint="eastAsia"/>
           <w:szCs w:val="22"/>
         </w:rPr>
-        <w:t>护甲等级：护甲等级有8个等级，轻/中/重甲各两个等级。穿深（穿甲等级）≥护甲等级可击穿</w:t>
+        <w:t>护甲等级：护甲等级有8个等级，轻/中/</w:t>
+      </w:r>
+      <w:proofErr w:type="gramStart"/>
+      <w:r>
+        <w:rPr>
+          <w:rFonts w:hint="eastAsia"/>
+          <w:szCs w:val="22"/>
+        </w:rPr>
+        <w:t>重甲各</w:t>
+      </w:r>
+      <w:proofErr w:type="gramEnd"/>
+      <w:r>
+        <w:rPr>
+          <w:rFonts w:hint="eastAsia"/>
+          <w:szCs w:val="22"/>
+        </w:rPr>
+        <w:t>两个等级。穿深（穿甲等级）≥护甲等级可击穿</w:t>
       </w:r>
       <w:r>
         <w:rPr>
@@ -3965,24 +4627,69 @@
           <w:sz w:val="16"/>
           <w:szCs w:val="16"/>
         </w:rPr>
-        <w:t>所以物理发出端必须同时达到破甲线和穿甲等级</w:t>
-      </w:r>
-    </w:p>
-    <w:p>
-      <w:pPr>
-        <w:ind w:leftChars="200" w:left="440"/>
-        <w:rPr>
-          <w:rFonts w:hint="eastAsia"/>
-          <w:szCs w:val="22"/>
-        </w:rPr>
-      </w:pPr>
-      <w:r>
-        <w:rPr>
-          <w:rFonts w:hint="eastAsia"/>
-          <w:szCs w:val="22"/>
-        </w:rPr>
-        <w:t>法术抗性：决定法术减伤率</w:t>
-      </w:r>
+        <w:t>所以物理发出</w:t>
+      </w:r>
+      <w:proofErr w:type="gramStart"/>
+      <w:r>
+        <w:rPr>
+          <w:rFonts w:hint="eastAsia"/>
+          <w:sz w:val="16"/>
+          <w:szCs w:val="16"/>
+        </w:rPr>
+        <w:t>端必须</w:t>
+      </w:r>
+      <w:proofErr w:type="gramEnd"/>
+      <w:r>
+        <w:rPr>
+          <w:rFonts w:hint="eastAsia"/>
+          <w:sz w:val="16"/>
+          <w:szCs w:val="16"/>
+        </w:rPr>
+        <w:t>同时达到</w:t>
+      </w:r>
+      <w:proofErr w:type="gramStart"/>
+      <w:r>
+        <w:rPr>
+          <w:rFonts w:hint="eastAsia"/>
+          <w:sz w:val="16"/>
+          <w:szCs w:val="16"/>
+        </w:rPr>
+        <w:t>破甲线和</w:t>
+      </w:r>
+      <w:proofErr w:type="gramEnd"/>
+      <w:r>
+        <w:rPr>
+          <w:rFonts w:hint="eastAsia"/>
+          <w:sz w:val="16"/>
+          <w:szCs w:val="16"/>
+        </w:rPr>
+        <w:t>穿甲等级</w:t>
+      </w:r>
+    </w:p>
+    <w:p>
+      <w:pPr>
+        <w:ind w:leftChars="200" w:left="440"/>
+        <w:rPr>
+          <w:rFonts w:hint="eastAsia"/>
+          <w:szCs w:val="22"/>
+        </w:rPr>
+      </w:pPr>
+      <w:r>
+        <w:rPr>
+          <w:rFonts w:hint="eastAsia"/>
+          <w:szCs w:val="22"/>
+        </w:rPr>
+        <w:t>法术抗性：决定法术</w:t>
+      </w:r>
+      <w:proofErr w:type="gramStart"/>
+      <w:r>
+        <w:rPr>
+          <w:rFonts w:hint="eastAsia"/>
+          <w:szCs w:val="22"/>
+        </w:rPr>
+        <w:t>减伤率</w:t>
+      </w:r>
+      <w:proofErr w:type="gramEnd"/>
     </w:p>
     <w:p>
       <w:pPr>
@@ -4007,7 +4714,25 @@
           <w:color w:val="7030A0"/>
           <w:szCs w:val="22"/>
         </w:rPr>
-        <w:t>：可以吸收一定倍率受到的法术伤害作为资源储存。根据护甲不同法术吸收量可以作为不同用途。在法术抗性之前计算。</w:t>
+        <w:t>：可以吸收一定倍率受到的法术伤害作为资源储存。根据护</w:t>
+      </w:r>
+      <w:proofErr w:type="gramStart"/>
+      <w:r>
+        <w:rPr>
+          <w:rFonts w:hint="eastAsia"/>
+          <w:color w:val="7030A0"/>
+          <w:szCs w:val="22"/>
+        </w:rPr>
+        <w:t>甲不同</w:t>
+      </w:r>
+      <w:proofErr w:type="gramEnd"/>
+      <w:r>
+        <w:rPr>
+          <w:rFonts w:hint="eastAsia"/>
+          <w:color w:val="7030A0"/>
+          <w:szCs w:val="22"/>
+        </w:rPr>
+        <w:t>法术吸收量可以作为不同用途。在法术抗性之前计算。</w:t>
       </w:r>
     </w:p>
     <w:p>
@@ -4100,7 +4825,7 @@
                     </pic:cNvPicPr>
                   </pic:nvPicPr>
                   <pic:blipFill>
-                    <a:blip r:embed="rId17">
+                    <a:blip r:embed="rId19">
                       <a:extLst>
                         <a:ext uri="{28A0092B-C50C-407E-A947-70E740481C1C}">
                           <a14:useLocalDpi xmlns:a14="http://schemas.microsoft.com/office/drawing/2010/main" val="0"/>
@@ -4164,7 +4889,7 @@
                     </pic:cNvPicPr>
                   </pic:nvPicPr>
                   <pic:blipFill>
-                    <a:blip r:embed="rId18" cstate="print">
+                    <a:blip r:embed="rId20" cstate="print">
                       <a:extLst>
                         <a:ext uri="{28A0092B-C50C-407E-A947-70E740481C1C}">
                           <a14:useLocalDpi xmlns:a14="http://schemas.microsoft.com/office/drawing/2010/main" val="0"/>
@@ -4374,7 +5099,23 @@
           <w:rFonts w:hint="eastAsia"/>
           <w:szCs w:val="22"/>
         </w:rPr>
-        <w:t>背包基础容量设计为60格，每格可堆叠数量却决于堆叠的物品。</w:t>
+        <w:t>背包基础容量设计为60格，</w:t>
+      </w:r>
+      <w:proofErr w:type="gramStart"/>
+      <w:r>
+        <w:rPr>
+          <w:rFonts w:hint="eastAsia"/>
+          <w:szCs w:val="22"/>
+        </w:rPr>
+        <w:t>每格可堆叠</w:t>
+      </w:r>
+      <w:proofErr w:type="gramEnd"/>
+      <w:r>
+        <w:rPr>
+          <w:rFonts w:hint="eastAsia"/>
+          <w:szCs w:val="22"/>
+        </w:rPr>
+        <w:t>数量却决于堆叠的物品。</w:t>
       </w:r>
     </w:p>
     <w:p>
@@ -4426,7 +5167,25 @@
           <w:sz w:val="20"/>
           <w:szCs w:val="20"/>
         </w:rPr>
-        <w:t>基本药水有生命药水和法术药水，生命药水和法术药水的数量和一定，可在家园或休息处分配生命或法术药水比例，与补充。</w:t>
+        <w:t>基本药水有生命药水和法术药水，生命药水和法术药水的数量和一定，可在家园或休息</w:t>
+      </w:r>
+      <w:proofErr w:type="gramStart"/>
+      <w:r>
+        <w:rPr>
+          <w:rFonts w:hint="eastAsia"/>
+          <w:sz w:val="20"/>
+          <w:szCs w:val="20"/>
+        </w:rPr>
+        <w:t>处分配</w:t>
+      </w:r>
+      <w:proofErr w:type="gramEnd"/>
+      <w:r>
+        <w:rPr>
+          <w:rFonts w:hint="eastAsia"/>
+          <w:sz w:val="20"/>
+          <w:szCs w:val="20"/>
+        </w:rPr>
+        <w:t>生命或法术药水比例，与补充。</w:t>
       </w:r>
       <w:r>
         <w:rPr>
@@ -4507,7 +5266,23 @@
           <w:rFonts w:hint="eastAsia"/>
           <w:szCs w:val="22"/>
         </w:rPr>
-        <w:t>物理攻击的减伤受接收方防御力和护甲等级影响</w:t>
+        <w:t>物理攻击的</w:t>
+      </w:r>
+      <w:proofErr w:type="gramStart"/>
+      <w:r>
+        <w:rPr>
+          <w:rFonts w:hint="eastAsia"/>
+          <w:szCs w:val="22"/>
+        </w:rPr>
+        <w:t>减伤受</w:t>
+      </w:r>
+      <w:proofErr w:type="gramEnd"/>
+      <w:r>
+        <w:rPr>
+          <w:rFonts w:hint="eastAsia"/>
+          <w:szCs w:val="22"/>
+        </w:rPr>
+        <w:t>接收方防御力和护甲等级影响</w:t>
       </w:r>
     </w:p>
     <w:p>
@@ -4523,7 +5298,23 @@
           <w:rFonts w:hint="eastAsia"/>
           <w:szCs w:val="22"/>
         </w:rPr>
-        <w:t>法术攻击的减伤受接收方法术抗性的影响</w:t>
+        <w:t>法术攻击的</w:t>
+      </w:r>
+      <w:proofErr w:type="gramStart"/>
+      <w:r>
+        <w:rPr>
+          <w:rFonts w:hint="eastAsia"/>
+          <w:szCs w:val="22"/>
+        </w:rPr>
+        <w:t>减伤受</w:t>
+      </w:r>
+      <w:proofErr w:type="gramEnd"/>
+      <w:r>
+        <w:rPr>
+          <w:rFonts w:hint="eastAsia"/>
+          <w:szCs w:val="22"/>
+        </w:rPr>
+        <w:t>接收方法术抗性的影响</w:t>
       </w:r>
     </w:p>
     <w:p>
@@ -4631,12 +5422,21 @@
           <w:szCs w:val="22"/>
         </w:rPr>
       </w:pPr>
-      <w:r>
-        <w:rPr>
-          <w:rFonts w:hint="eastAsia"/>
-          <w:szCs w:val="22"/>
-        </w:rPr>
-        <w:t>毒/眠/麻/爆/出血</w:t>
+      <w:proofErr w:type="gramStart"/>
+      <w:r>
+        <w:rPr>
+          <w:rFonts w:hint="eastAsia"/>
+          <w:szCs w:val="22"/>
+        </w:rPr>
+        <w:t>毒/眠</w:t>
+      </w:r>
+      <w:proofErr w:type="gramEnd"/>
+      <w:r>
+        <w:rPr>
+          <w:rFonts w:hint="eastAsia"/>
+          <w:szCs w:val="22"/>
+        </w:rPr>
+        <w:t>/麻/爆/出血</w:t>
       </w:r>
     </w:p>
     <w:p>
@@ -4670,7 +5470,23 @@
           <w:rFonts w:hint="eastAsia"/>
           <w:szCs w:val="22"/>
         </w:rPr>
-        <w:t>冰属性：冰属性异常值满后进入冰属性异常状态，增加受到的物理伤害</w:t>
+        <w:t>冰属性：冰属性</w:t>
+      </w:r>
+      <w:proofErr w:type="gramStart"/>
+      <w:r>
+        <w:rPr>
+          <w:rFonts w:hint="eastAsia"/>
+          <w:szCs w:val="22"/>
+        </w:rPr>
+        <w:t>异常值满后</w:t>
+      </w:r>
+      <w:proofErr w:type="gramEnd"/>
+      <w:r>
+        <w:rPr>
+          <w:rFonts w:hint="eastAsia"/>
+          <w:szCs w:val="22"/>
+        </w:rPr>
+        <w:t>进入冰属性异常状态，增加受到的物理伤害</w:t>
       </w:r>
     </w:p>
     <w:p>
@@ -4702,7 +5518,23 @@
           <w:rFonts w:hint="eastAsia"/>
           <w:szCs w:val="22"/>
         </w:rPr>
-        <w:t>水属性：水属性异常值满后会增加体力消耗量</w:t>
+        <w:t>水属性：水属性</w:t>
+      </w:r>
+      <w:proofErr w:type="gramStart"/>
+      <w:r>
+        <w:rPr>
+          <w:rFonts w:hint="eastAsia"/>
+          <w:szCs w:val="22"/>
+        </w:rPr>
+        <w:t>异常值满后会</w:t>
+      </w:r>
+      <w:proofErr w:type="gramEnd"/>
+      <w:r>
+        <w:rPr>
+          <w:rFonts w:hint="eastAsia"/>
+          <w:szCs w:val="22"/>
+        </w:rPr>
+        <w:t>增加体力消耗量</w:t>
       </w:r>
     </w:p>
     <w:p>
@@ -4718,7 +5550,23 @@
           <w:rFonts w:hint="eastAsia"/>
           <w:szCs w:val="22"/>
         </w:rPr>
-        <w:t>雷属性：雷属性异常值满后受到攻击容易进入眩晕状态，并少许增加受到的法术伤害</w:t>
+        <w:t>雷属性：雷属性</w:t>
+      </w:r>
+      <w:proofErr w:type="gramStart"/>
+      <w:r>
+        <w:rPr>
+          <w:rFonts w:hint="eastAsia"/>
+          <w:szCs w:val="22"/>
+        </w:rPr>
+        <w:t>异常值满后</w:t>
+      </w:r>
+      <w:proofErr w:type="gramEnd"/>
+      <w:r>
+        <w:rPr>
+          <w:rFonts w:hint="eastAsia"/>
+          <w:szCs w:val="22"/>
+        </w:rPr>
+        <w:t>受到攻击容易进入眩晕状态，并少许增加受到的法术伤害</w:t>
       </w:r>
     </w:p>
     <w:p>
@@ -4734,7 +5582,23 @@
           <w:rFonts w:hint="eastAsia"/>
           <w:szCs w:val="22"/>
         </w:rPr>
-        <w:t>龙属性：龙属性异常值满后会降低自身输出的法术（元素）伤害</w:t>
+        <w:t>龙属性：龙属性</w:t>
+      </w:r>
+      <w:proofErr w:type="gramStart"/>
+      <w:r>
+        <w:rPr>
+          <w:rFonts w:hint="eastAsia"/>
+          <w:szCs w:val="22"/>
+        </w:rPr>
+        <w:t>异常值满后会</w:t>
+      </w:r>
+      <w:proofErr w:type="gramEnd"/>
+      <w:r>
+        <w:rPr>
+          <w:rFonts w:hint="eastAsia"/>
+          <w:szCs w:val="22"/>
+        </w:rPr>
+        <w:t>降低自身输出的法术（元素）伤害</w:t>
       </w:r>
     </w:p>
     <w:p>
@@ -4837,7 +5701,23 @@
           <w:rFonts w:hint="eastAsia"/>
           <w:szCs w:val="22"/>
         </w:rPr>
-        <w:t>防御性能决定了格挡是否能防住，敌人的攻击。</w:t>
+        <w:t>防御性能决定了格</w:t>
+      </w:r>
+      <w:proofErr w:type="gramStart"/>
+      <w:r>
+        <w:rPr>
+          <w:rFonts w:hint="eastAsia"/>
+          <w:szCs w:val="22"/>
+        </w:rPr>
+        <w:t>挡是否</w:t>
+      </w:r>
+      <w:proofErr w:type="gramEnd"/>
+      <w:r>
+        <w:rPr>
+          <w:rFonts w:hint="eastAsia"/>
+          <w:szCs w:val="22"/>
+        </w:rPr>
+        <w:t>能防住，敌人的攻击。</w:t>
       </w:r>
       <w:r>
         <w:rPr>
@@ -4892,7 +5772,39 @@
           <w:rFonts w:hint="eastAsia"/>
           <w:szCs w:val="22"/>
         </w:rPr>
-        <w:t>持续格挡可以根据盾牌减伤率吸收伤害，受到攻击消耗体力</w:t>
+        <w:t>持续格</w:t>
+      </w:r>
+      <w:proofErr w:type="gramStart"/>
+      <w:r>
+        <w:rPr>
+          <w:rFonts w:hint="eastAsia"/>
+          <w:szCs w:val="22"/>
+        </w:rPr>
+        <w:t>挡可以</w:t>
+      </w:r>
+      <w:proofErr w:type="gramEnd"/>
+      <w:r>
+        <w:rPr>
+          <w:rFonts w:hint="eastAsia"/>
+          <w:szCs w:val="22"/>
+        </w:rPr>
+        <w:t>根据盾牌</w:t>
+      </w:r>
+      <w:proofErr w:type="gramStart"/>
+      <w:r>
+        <w:rPr>
+          <w:rFonts w:hint="eastAsia"/>
+          <w:szCs w:val="22"/>
+        </w:rPr>
+        <w:t>减伤率吸收</w:t>
+      </w:r>
+      <w:proofErr w:type="gramEnd"/>
+      <w:r>
+        <w:rPr>
+          <w:rFonts w:hint="eastAsia"/>
+          <w:szCs w:val="22"/>
+        </w:rPr>
+        <w:t>伤害，受到攻击消耗体力</w:t>
       </w:r>
     </w:p>
     <w:p>
@@ -4926,8 +5838,17 @@
           <w:rFonts w:hint="eastAsia"/>
           <w:szCs w:val="22"/>
         </w:rPr>
-        <w:t>启动格挡瞬间为精准格挡，若精准格挡与敌人攻击重合，在持续格挡的基础上大幅降低该次收到的伤害和消耗的体力，并会累加角力值</w:t>
-      </w:r>
+        <w:t>启动格挡瞬间为精准格挡，若精准格挡与敌人攻击重合，在持续格挡的基础上大幅降低该次收到的伤害和消耗的体力，并会累加</w:t>
+      </w:r>
+      <w:proofErr w:type="gramStart"/>
+      <w:r>
+        <w:rPr>
+          <w:rFonts w:hint="eastAsia"/>
+          <w:szCs w:val="22"/>
+        </w:rPr>
+        <w:t>角力值</w:t>
+      </w:r>
+      <w:proofErr w:type="gramEnd"/>
       <w:r>
         <w:rPr>
           <w:rFonts w:hint="eastAsia"/>
@@ -4953,6 +5874,7 @@
           <w:szCs w:val="28"/>
         </w:rPr>
       </w:pPr>
+      <w:proofErr w:type="spellStart"/>
       <w:r>
         <w:rPr>
           <w:rFonts w:hint="eastAsia"/>
@@ -4961,6 +5883,7 @@
         </w:rPr>
         <w:t>GuardPoint</w:t>
       </w:r>
+      <w:proofErr w:type="spellEnd"/>
       <w:r>
         <w:rPr>
           <w:rFonts w:hint="eastAsia"/>
@@ -5076,40 +5999,59 @@
           <w:sz w:val="28"/>
           <w:szCs w:val="28"/>
         </w:rPr>
-        <w:t>无敌帧</w:t>
-      </w:r>
-    </w:p>
-    <w:p>
-      <w:pPr>
-        <w:ind w:leftChars="387" w:left="851"/>
-        <w:rPr>
-          <w:rFonts w:hint="eastAsia"/>
-          <w:szCs w:val="22"/>
-        </w:rPr>
-      </w:pPr>
-      <w:r>
-        <w:rPr>
-          <w:rFonts w:hint="eastAsia"/>
-          <w:szCs w:val="22"/>
-        </w:rPr>
-        <w:t>基础的闪避动作存在无敌帧，可以通过装备增加回避性能增加闪避无敌帧</w:t>
-      </w:r>
-    </w:p>
-    <w:p>
-      <w:pPr>
-        <w:ind w:leftChars="187" w:left="411" w:firstLine="369"/>
+        <w:t>无敌</w:t>
+      </w:r>
+      <w:proofErr w:type="gramStart"/>
+      <w:r>
         <w:rPr>
           <w:rFonts w:hint="eastAsia"/>
           <w:sz w:val="28"/>
           <w:szCs w:val="28"/>
         </w:rPr>
-      </w:pPr>
-      <w:r>
+        <w:t>帧</w:t>
+      </w:r>
+      <w:proofErr w:type="gramEnd"/>
+    </w:p>
+    <w:p>
+      <w:pPr>
+        <w:ind w:leftChars="387" w:left="851"/>
+        <w:rPr>
+          <w:rFonts w:hint="eastAsia"/>
+          <w:szCs w:val="22"/>
+        </w:rPr>
+      </w:pPr>
+      <w:r>
+        <w:rPr>
+          <w:rFonts w:hint="eastAsia"/>
+          <w:szCs w:val="22"/>
+        </w:rPr>
+        <w:t>基础的闪避动作存在无敌帧，可以通过装备增加回避性能增加闪避无敌</w:t>
+      </w:r>
+      <w:proofErr w:type="gramStart"/>
+      <w:r>
+        <w:rPr>
+          <w:rFonts w:hint="eastAsia"/>
+          <w:szCs w:val="22"/>
+        </w:rPr>
+        <w:t>帧</w:t>
+      </w:r>
+      <w:proofErr w:type="gramEnd"/>
+    </w:p>
+    <w:p>
+      <w:pPr>
+        <w:ind w:leftChars="187" w:left="411" w:firstLine="369"/>
         <w:rPr>
           <w:rFonts w:hint="eastAsia"/>
           <w:sz w:val="28"/>
           <w:szCs w:val="28"/>
         </w:rPr>
+      </w:pPr>
+      <w:r>
+        <w:rPr>
+          <w:rFonts w:hint="eastAsia"/>
+          <w:sz w:val="28"/>
+          <w:szCs w:val="28"/>
+        </w:rPr>
         <w:t>完美闪避</w:t>
       </w:r>
     </w:p>
@@ -5226,7 +6168,23 @@
           <w:rFonts w:hint="eastAsia"/>
           <w:szCs w:val="22"/>
         </w:rPr>
-        <w:t>部分武器在闪避时会维持闪避方向的格挡状态，此时被攻击则格挡成功，可在触发后短时间内接入无法格挡的、必中的攻击。</w:t>
+        <w:t>部分武器在闪避时会维持闪避方向的格挡状态，此时被</w:t>
+      </w:r>
+      <w:proofErr w:type="gramStart"/>
+      <w:r>
+        <w:rPr>
+          <w:rFonts w:hint="eastAsia"/>
+          <w:szCs w:val="22"/>
+        </w:rPr>
+        <w:t>攻击则格挡</w:t>
+      </w:r>
+      <w:proofErr w:type="gramEnd"/>
+      <w:r>
+        <w:rPr>
+          <w:rFonts w:hint="eastAsia"/>
+          <w:szCs w:val="22"/>
+        </w:rPr>
+        <w:t>成功，可在触发后短时间内接入无法格挡的、必中的攻击。</w:t>
       </w:r>
     </w:p>
     <w:p>
@@ -5328,7 +6286,23 @@
           <w:rFonts w:hint="eastAsia"/>
           <w:szCs w:val="22"/>
         </w:rPr>
-        <w:t>完美格挡、优势格挡、抵消均会累积角力值，角力值满即和敌人角力。</w:t>
+        <w:t>完美格挡、优势格挡、抵消均会累积角力值，</w:t>
+      </w:r>
+      <w:proofErr w:type="gramStart"/>
+      <w:r>
+        <w:rPr>
+          <w:rFonts w:hint="eastAsia"/>
+          <w:szCs w:val="22"/>
+        </w:rPr>
+        <w:t>角力值满</w:t>
+      </w:r>
+      <w:proofErr w:type="gramEnd"/>
+      <w:r>
+        <w:rPr>
+          <w:rFonts w:hint="eastAsia"/>
+          <w:szCs w:val="22"/>
+        </w:rPr>
+        <w:t>即和敌人角力。</w:t>
       </w:r>
     </w:p>
     <w:p>
@@ -5339,12 +6313,21 @@
           <w:szCs w:val="22"/>
         </w:rPr>
       </w:pPr>
-      <w:r>
-        <w:rPr>
-          <w:rFonts w:hint="eastAsia"/>
-          <w:szCs w:val="22"/>
-        </w:rPr>
-        <w:t>靠连点赢得角力，成功可获得敌人硬直。</w:t>
+      <w:proofErr w:type="gramStart"/>
+      <w:r>
+        <w:rPr>
+          <w:rFonts w:hint="eastAsia"/>
+          <w:szCs w:val="22"/>
+        </w:rPr>
+        <w:t>靠连点赢得</w:t>
+      </w:r>
+      <w:proofErr w:type="gramEnd"/>
+      <w:r>
+        <w:rPr>
+          <w:rFonts w:hint="eastAsia"/>
+          <w:szCs w:val="22"/>
+        </w:rPr>
+        <w:t>角力，成功可获得敌人硬直。</w:t>
       </w:r>
     </w:p>
     <w:p>
@@ -5454,7 +6437,25 @@
           <w:color w:val="000000" w:themeColor="text1"/>
           <w:szCs w:val="22"/>
         </w:rPr>
-        <w:t>保持渲染风格一致，为像素画风格。Godot引擎中的Nearest渲染方式。</w:t>
+        <w:t>保持渲染风格一致，为</w:t>
+      </w:r>
+      <w:proofErr w:type="gramStart"/>
+      <w:r>
+        <w:rPr>
+          <w:rFonts w:hint="eastAsia"/>
+          <w:color w:val="000000" w:themeColor="text1"/>
+          <w:szCs w:val="22"/>
+        </w:rPr>
+        <w:t>像素画</w:t>
+      </w:r>
+      <w:proofErr w:type="gramEnd"/>
+      <w:r>
+        <w:rPr>
+          <w:rFonts w:hint="eastAsia"/>
+          <w:color w:val="000000" w:themeColor="text1"/>
+          <w:szCs w:val="22"/>
+        </w:rPr>
+        <w:t>风格。Godot引擎中的Nearest渲染方式。</w:t>
       </w:r>
     </w:p>
     <w:p>
@@ -5573,7 +6574,7 @@
                     </pic:cNvPicPr>
                   </pic:nvPicPr>
                   <pic:blipFill>
-                    <a:blip r:embed="rId19" cstate="print">
+                    <a:blip r:embed="rId21" cstate="print">
                       <a:extLst>
                         <a:ext uri="{28A0092B-C50C-407E-A947-70E740481C1C}">
                           <a14:useLocalDpi xmlns:a14="http://schemas.microsoft.com/office/drawing/2010/main" val="0"/>
@@ -5622,7 +6623,27 @@
           <w:sz w:val="16"/>
           <w:szCs w:val="16"/>
         </w:rPr>
-        <w:t>使用Resprite手绘素材</w:t>
+        <w:t>使用</w:t>
+      </w:r>
+      <w:proofErr w:type="spellStart"/>
+      <w:r>
+        <w:rPr>
+          <w:rFonts w:hint="eastAsia"/>
+          <w:color w:val="000000" w:themeColor="text1"/>
+          <w:sz w:val="16"/>
+          <w:szCs w:val="16"/>
+        </w:rPr>
+        <w:t>Resprite</w:t>
+      </w:r>
+      <w:proofErr w:type="spellEnd"/>
+      <w:r>
+        <w:rPr>
+          <w:rFonts w:hint="eastAsia"/>
+          <w:color w:val="000000" w:themeColor="text1"/>
+          <w:sz w:val="16"/>
+          <w:szCs w:val="16"/>
+        </w:rPr>
+        <w:t>手绘素材</w:t>
       </w:r>
     </w:p>
     <w:p>
@@ -5670,7 +6691,7 @@
                     </pic:cNvPicPr>
                   </pic:nvPicPr>
                   <pic:blipFill>
-                    <a:blip r:embed="rId20">
+                    <a:blip r:embed="rId22">
                       <a:extLst>
                         <a:ext uri="{28A0092B-C50C-407E-A947-70E740481C1C}">
                           <a14:useLocalDpi xmlns:a14="http://schemas.microsoft.com/office/drawing/2010/main" val="0"/>
@@ -5743,7 +6764,7 @@
                     </pic:cNvPicPr>
                   </pic:nvPicPr>
                   <pic:blipFill>
-                    <a:blip r:embed="rId21">
+                    <a:blip r:embed="rId23">
                       <a:extLst>
                         <a:ext uri="{28A0092B-C50C-407E-A947-70E740481C1C}">
                           <a14:useLocalDpi xmlns:a14="http://schemas.microsoft.com/office/drawing/2010/main" val="0"/>
@@ -5799,7 +6820,7 @@
                     </pic:cNvPicPr>
                   </pic:nvPicPr>
                   <pic:blipFill>
-                    <a:blip r:embed="rId22">
+                    <a:blip r:embed="rId24">
                       <a:extLst>
                         <a:ext uri="{28A0092B-C50C-407E-A947-70E740481C1C}">
                           <a14:useLocalDpi xmlns:a14="http://schemas.microsoft.com/office/drawing/2010/main" val="0"/>
@@ -5856,7 +6877,7 @@
                     </pic:cNvPicPr>
                   </pic:nvPicPr>
                   <pic:blipFill>
-                    <a:blip r:embed="rId23">
+                    <a:blip r:embed="rId25">
                       <a:extLst>
                         <a:ext uri="{28A0092B-C50C-407E-A947-70E740481C1C}">
                           <a14:useLocalDpi xmlns:a14="http://schemas.microsoft.com/office/drawing/2010/main" val="0"/>

</xml_diff>